<commit_message>
609 doing task2 based on 611 task 2 based on 611 task2
</commit_message>
<xml_diff>
--- a/2026-T3/B2-ICTSAD609-Plan_Monitor/2-Task2/Task2.docx
+++ b/2026-T3/B2-ICTSAD609-Plan_Monitor/2-Task2/Task2.docx
@@ -46,28 +46,3320 @@
       </w:r>
       <w:r>
         <w:br/>
-        <w:t xml:space="preserve">1. </w:t>
-      </w:r>
-      <w:r>
-        <w:t>Cloud-First SaaS and B2C Model</w:t>
+        <w:t>1. Cloud-First SaaS and B2C Model</w:t>
       </w:r>
       <w:r>
         <w:br/>
-      </w:r>
-      <w:r>
         <w:t>2. Strategic Hardware Partnerships and Outsourced Distribution</w:t>
+      </w:r>
+    </w:p>
+    <w:p>
+      <w:pPr>
+        <w:rPr>
+          <w:b/>
+          <w:bCs/>
+        </w:rPr>
+      </w:pPr>
+    </w:p>
+    <w:p>
+      <w:pPr>
+        <w:rPr>
+          <w:b/>
+          <w:bCs/>
+        </w:rPr>
+      </w:pPr>
+      <w:r>
+        <w:rPr>
+          <w:b/>
+          <w:bCs/>
+        </w:rPr>
+        <w:t>Section 1:</w:t>
+      </w:r>
+    </w:p>
+    <w:p>
+      <w:pPr>
+        <w:rPr>
+          <w:b/>
+          <w:bCs/>
+        </w:rPr>
+      </w:pPr>
+    </w:p>
+    <w:p>
+      <w:pPr>
+        <w:rPr>
+          <w:b/>
+          <w:bCs/>
+        </w:rPr>
+      </w:pPr>
+      <w:r>
+        <w:rPr>
+          <w:b/>
+          <w:bCs/>
+        </w:rPr>
+        <w:t>Business Overview</w:t>
+      </w:r>
+    </w:p>
+    <w:p>
+      <w:pPr>
+        <w:rPr>
+          <w:b/>
+          <w:bCs/>
+        </w:rPr>
+      </w:pPr>
+    </w:p>
+    <w:p>
+      <w:pPr>
+        <w:rPr>
+          <w:b/>
+          <w:bCs/>
+        </w:rPr>
+      </w:pPr>
+      <w:r>
+        <w:rPr>
+          <w:b/>
+          <w:bCs/>
+        </w:rPr>
+        <w:t>Worlducation</w:t>
+      </w:r>
+    </w:p>
+    <w:p>
+      <w:r>
+        <w:t>Worlducation is a social startup founded in 2016, headquartered in Sydney's CBD, with a development team in Bulgaria, a manufacturing team in Hong Kong, and operations and marketing staff in Colombia, Egypt, Iceland, Russia, and the Philippines. The company manufactures AI-powered tablet computers for elementary school students and develops educational software, content, and activities designed to adapt to each child's individual learning progress.</w:t>
+      </w:r>
+    </w:p>
+    <w:p>
+      <w:r>
+        <w:t>Worlducation operates on a B2B model, selling its tablets and software subscriptions directly to schools and educational institutions. By the end of 2019, the organization had sold more than 35,000 tablets to over 550 schools in 23 countries. Its unique value proposition is a one-to-one donation model: for every classroom that purchases its products, Worlducation donates and trains a classroom in an underserved community globally, connecting both classrooms for collaborative learning.</w:t>
+      </w:r>
+    </w:p>
+    <w:p>
+      <w:r>
+        <w:t>The company's long-term strategy includes expanding into a B2C model and continuing to innovate in AI-powered educational technology. In 2020, Worlducation faced significant operational disruption due to the COVID-19 pandemic, which closed its Hong Kong factory for a month, caused supply chain delays (only 500 of the 2,000 tablets scheduled were shipped before April 2020), and created financial pressure: while revenue was revised upward to a projected $55 million, net profit fell to $5 million and net cash flow turned negative at -$3 million.</w:t>
       </w:r>
     </w:p>
     <w:p/>
+    <w:p>
+      <w:pPr>
+        <w:rPr>
+          <w:b/>
+          <w:bCs/>
+        </w:rPr>
+      </w:pPr>
+      <w:r>
+        <w:rPr>
+          <w:b/>
+          <w:bCs/>
+        </w:rPr>
+        <w:br w:type="page"/>
+      </w:r>
+    </w:p>
+    <w:p>
+      <w:pPr>
+        <w:rPr>
+          <w:b/>
+          <w:bCs/>
+        </w:rPr>
+      </w:pPr>
+      <w:r>
+        <w:rPr>
+          <w:b/>
+          <w:bCs/>
+        </w:rPr>
+        <w:lastRenderedPageBreak/>
+        <w:t xml:space="preserve">ICT business analysis initiatives </w:t>
+      </w:r>
+    </w:p>
+    <w:p>
+      <w:r>
+        <w:t>1. Cloud-First SaaS and B2C Model</w:t>
+      </w:r>
+    </w:p>
+    <w:p>
+      <w:r>
+        <w:t>2. Strategic Hardware Partnerships and Outsourced Distribution</w:t>
+      </w:r>
+    </w:p>
+    <w:p/>
+    <w:p>
+      <w:pPr>
+        <w:rPr>
+          <w:b/>
+          <w:bCs/>
+        </w:rPr>
+      </w:pPr>
+      <w:r>
+        <w:rPr>
+          <w:b/>
+          <w:bCs/>
+        </w:rPr>
+        <w:t>Cloud-First SaaS and B2C Model</w:t>
+      </w:r>
+    </w:p>
+    <w:p>
+      <w:r>
+        <w:t>This is a S</w:t>
+      </w:r>
+      <w:r>
+        <w:t>oftware Transformation/Digital Business</w:t>
+      </w:r>
+      <w:r>
+        <w:t xml:space="preserve"> </w:t>
+      </w:r>
+      <w:r>
+        <w:t>Model Transition</w:t>
+      </w:r>
+    </w:p>
+    <w:p/>
+    <w:p>
+      <w:r>
+        <w:t xml:space="preserve">This initiative proposes transitioning the delivery of </w:t>
+      </w:r>
+      <w:proofErr w:type="spellStart"/>
+      <w:r>
+        <w:t>Worlducation's</w:t>
+      </w:r>
+      <w:proofErr w:type="spellEnd"/>
+      <w:r>
+        <w:t xml:space="preserve"> core product from a hardware-dependent B2B model to a cloud-based SaaS platform accessible from any device, combined with a B2C sales model targeting individual students, parents, and schools. The initiative involves dismantling the reliance on physical tablet manufacturing, migrating AI-powered learning software to a cloud architecture, building a self-service B2C subscription portal, and enabling direct digital delivery to end consumers globally.</w:t>
+      </w:r>
+    </w:p>
+    <w:p>
+      <w:r>
+        <w:t xml:space="preserve">From a financial perspective, the initiative requires an estimated initial investment of $2 million for cloud infrastructure, software redesign, and cybersecurity measures. This compares </w:t>
+      </w:r>
+      <w:proofErr w:type="spellStart"/>
+      <w:r>
+        <w:t>favorably</w:t>
+      </w:r>
+      <w:proofErr w:type="spellEnd"/>
+      <w:r>
+        <w:t xml:space="preserve"> to the $5 million needed for a second manufacturing facility or the $3 million in annual margin lost from purchasing commercial tablets. The SaaS model eliminates manufacturing costs and</w:t>
+      </w:r>
+      <w:r>
+        <w:t xml:space="preserve"> </w:t>
+      </w:r>
+      <w:r>
+        <w:t>generates recurring subscription revenue, directly addressing the</w:t>
+      </w:r>
+      <w:r>
+        <w:t xml:space="preserve"> </w:t>
+      </w:r>
+      <w:r>
+        <w:t>projected negative cash flow of -$3 million for 2020.</w:t>
+      </w:r>
+    </w:p>
+    <w:p/>
+    <w:p>
+      <w:pPr>
+        <w:rPr>
+          <w:rFonts w:ascii="Helvetica Neue" w:hAnsi="Helvetica Neue"/>
+          <w:color w:val="20374B"/>
+          <w:shd w:val="clear" w:color="auto" w:fill="FFFFFF"/>
+        </w:rPr>
+      </w:pPr>
+      <w:r>
+        <w:rPr>
+          <w:rFonts w:ascii="Helvetica Neue" w:hAnsi="Helvetica Neue"/>
+          <w:color w:val="20374B"/>
+          <w:shd w:val="clear" w:color="auto" w:fill="FFFFFF"/>
+        </w:rPr>
+        <w:t>SWAT analysis</w:t>
+      </w:r>
+    </w:p>
+    <w:tbl>
+      <w:tblPr>
+        <w:tblStyle w:val="TableGrid"/>
+        <w:tblW w:w="0" w:type="auto"/>
+        <w:tblLook w:val="04A0" w:firstRow="1" w:lastRow="0" w:firstColumn="1" w:lastColumn="0" w:noHBand="0" w:noVBand="1"/>
+      </w:tblPr>
+      <w:tblGrid>
+        <w:gridCol w:w="4802"/>
+        <w:gridCol w:w="5654"/>
+      </w:tblGrid>
+      <w:tr>
+        <w:tc>
+          <w:tcPr>
+            <w:tcW w:w="0" w:type="auto"/>
+            <w:hideMark/>
+          </w:tcPr>
+          <w:p>
+            <w:pPr>
+              <w:spacing w:after="160" w:line="278" w:lineRule="auto"/>
+              <w:rPr>
+                <w:b/>
+                <w:bCs/>
+              </w:rPr>
+            </w:pPr>
+            <w:r>
+              <w:rPr>
+                <w:b/>
+                <w:bCs/>
+              </w:rPr>
+              <w:t>Strengths</w:t>
+            </w:r>
+          </w:p>
+        </w:tc>
+        <w:tc>
+          <w:tcPr>
+            <w:tcW w:w="0" w:type="auto"/>
+            <w:hideMark/>
+          </w:tcPr>
+          <w:p>
+            <w:pPr>
+              <w:spacing w:after="160" w:line="278" w:lineRule="auto"/>
+              <w:rPr>
+                <w:b/>
+                <w:bCs/>
+              </w:rPr>
+            </w:pPr>
+            <w:r>
+              <w:rPr>
+                <w:b/>
+                <w:bCs/>
+              </w:rPr>
+              <w:t>Weaknesses</w:t>
+            </w:r>
+          </w:p>
+        </w:tc>
+      </w:tr>
+      <w:tr>
+        <w:tc>
+          <w:tcPr>
+            <w:tcW w:w="0" w:type="auto"/>
+            <w:hideMark/>
+          </w:tcPr>
+          <w:p>
+            <w:r>
+              <w:t>- Strong in-house AI and software development capabilities (development team in Bulgaria)</w:t>
+            </w:r>
+          </w:p>
+          <w:p>
+            <w:r>
+              <w:t>- Established relationships with clients in over 550 schools across 23 countries</w:t>
+            </w:r>
+          </w:p>
+          <w:p>
+            <w:r>
+              <w:t>- Strong management team with available investment funding</w:t>
+            </w:r>
+          </w:p>
+          <w:p>
+            <w:pPr>
+              <w:spacing w:after="160" w:line="278" w:lineRule="auto"/>
+            </w:pPr>
+            <w:r>
+              <w:t>- Proven AI learning platform with demonstrated educational outcomes</w:t>
+            </w:r>
+          </w:p>
+        </w:tc>
+        <w:tc>
+          <w:tcPr>
+            <w:tcW w:w="0" w:type="auto"/>
+            <w:hideMark/>
+          </w:tcPr>
+          <w:p>
+            <w:r>
+              <w:t>- Lack of a B2C platform or digital subscription infrastructure</w:t>
+            </w:r>
+          </w:p>
+          <w:p>
+            <w:r>
+              <w:t>- Staff skills gaps in SaaS operations, digital marketing, and B2C customer service</w:t>
+            </w:r>
+          </w:p>
+          <w:p>
+            <w:r>
+              <w:t>- Growing organization with limited internal capacity for large-scale ICT transformations</w:t>
+            </w:r>
+          </w:p>
+          <w:p>
+            <w:pPr>
+              <w:spacing w:after="160" w:line="278" w:lineRule="auto"/>
+            </w:pPr>
+            <w:r>
+              <w:t>- Brand not yet widely recognized by end consumers</w:t>
+            </w:r>
+          </w:p>
+        </w:tc>
+      </w:tr>
+      <w:tr>
+        <w:tc>
+          <w:tcPr>
+            <w:tcW w:w="0" w:type="auto"/>
+            <w:hideMark/>
+          </w:tcPr>
+          <w:p>
+            <w:pPr>
+              <w:spacing w:after="160" w:line="278" w:lineRule="auto"/>
+            </w:pPr>
+            <w:r>
+              <w:rPr>
+                <w:b/>
+                <w:bCs/>
+              </w:rPr>
+              <w:t>Opportunities</w:t>
+            </w:r>
+          </w:p>
+        </w:tc>
+        <w:tc>
+          <w:tcPr>
+            <w:tcW w:w="0" w:type="auto"/>
+            <w:hideMark/>
+          </w:tcPr>
+          <w:p>
+            <w:pPr>
+              <w:spacing w:after="160" w:line="278" w:lineRule="auto"/>
+            </w:pPr>
+            <w:r>
+              <w:rPr>
+                <w:b/>
+                <w:bCs/>
+              </w:rPr>
+              <w:t>Threats</w:t>
+            </w:r>
+          </w:p>
+        </w:tc>
+      </w:tr>
+      <w:tr>
+        <w:tc>
+          <w:tcPr>
+            <w:tcW w:w="0" w:type="auto"/>
+            <w:hideMark/>
+          </w:tcPr>
+          <w:p>
+            <w:r>
+              <w:t>- COVID-19 accelerating the adoption of remote and digital learning solutions globally</w:t>
+            </w:r>
+          </w:p>
+          <w:p>
+            <w:r>
+              <w:t>- Schools and families seeking accessible, device-independent educational technology</w:t>
+            </w:r>
+          </w:p>
+          <w:p>
+            <w:r>
+              <w:t>- Opportunity to scale globally without increasing manufacturing capacity</w:t>
+            </w:r>
+          </w:p>
+          <w:p>
+            <w:pPr>
+              <w:spacing w:after="160" w:line="278" w:lineRule="auto"/>
+            </w:pPr>
+            <w:r>
+              <w:lastRenderedPageBreak/>
+              <w:t>- Growing EdTech market driven by artificial intelligence and Internet of Things (IoT) technologies</w:t>
+            </w:r>
+          </w:p>
+        </w:tc>
+        <w:tc>
+          <w:tcPr>
+            <w:tcW w:w="0" w:type="auto"/>
+            <w:hideMark/>
+          </w:tcPr>
+          <w:p>
+            <w:r>
+              <w:lastRenderedPageBreak/>
+              <w:t>- Cybersecurity risks associated with storing and processing student data in the cloud</w:t>
+            </w:r>
+          </w:p>
+          <w:p>
+            <w:r>
+              <w:t>- Established SaaS competitors (Google Classroom, Microsoft Education, Duolingo) with a stronger market presence</w:t>
+            </w:r>
+          </w:p>
+          <w:p>
+            <w:r>
+              <w:t>- The initial transition period may put greater pressure on short-term cash flow before subscription revenue stabilizes</w:t>
+            </w:r>
+          </w:p>
+          <w:p>
+            <w:pPr>
+              <w:spacing w:after="160" w:line="278" w:lineRule="auto"/>
+            </w:pPr>
+            <w:r>
+              <w:lastRenderedPageBreak/>
+              <w:t>- Regulatory requirements regarding the privacy of minors' data under applicable legislation</w:t>
+            </w:r>
+          </w:p>
+        </w:tc>
+      </w:tr>
+    </w:tbl>
+    <w:p/>
+    <w:p/>
+    <w:p>
+      <w:pPr>
+        <w:rPr>
+          <w:b/>
+          <w:bCs/>
+        </w:rPr>
+      </w:pPr>
+      <w:r>
+        <w:rPr>
+          <w:b/>
+          <w:bCs/>
+        </w:rPr>
+        <w:t>Alignment with the Organization's Vision and Strategy</w:t>
+      </w:r>
+    </w:p>
+    <w:p>
+      <w:pPr>
+        <w:rPr>
+          <w:b/>
+          <w:bCs/>
+        </w:rPr>
+      </w:pPr>
+    </w:p>
+    <w:p>
+      <w:proofErr w:type="spellStart"/>
+      <w:r>
+        <w:t>Worlducation's</w:t>
+      </w:r>
+      <w:proofErr w:type="spellEnd"/>
+      <w:r>
+        <w:t xml:space="preserve"> vision is "to see a world without illiteracy," and its mission is to expand access to quality education globally.</w:t>
+      </w:r>
+    </w:p>
+    <w:p>
+      <w:r>
+        <w:t xml:space="preserve">The Cloud-Centric B2C SaaS initiative directly supports this vision by eliminating the physical and logistical barriers of hardware dependency, enabling any student in the world to access </w:t>
+      </w:r>
+      <w:proofErr w:type="spellStart"/>
+      <w:r>
+        <w:t>Worlducation's</w:t>
+      </w:r>
+      <w:proofErr w:type="spellEnd"/>
+      <w:r>
+        <w:t xml:space="preserve"> AI-powered learning platform from their own device. This initiative also aligns with the organization's strategic priorities: achieving at least 10% annual profit growth (by reducing OPEX and generating recurring revenue), increasing reach (by serving individual consumers globally without manufacturing constraints), and building deeper customer relationships (by offering a seamless digital service experience). The initiative was formally proposed for approval by Manuel Perez, IT Professional, to Senior Management and the Founders, as documented in the attached approval request letter.</w:t>
+      </w:r>
+    </w:p>
+    <w:p/>
+    <w:p>
+      <w:r>
+        <w:rPr>
+          <w:b/>
+          <w:bCs/>
+        </w:rPr>
+        <w:t>Objectives</w:t>
+      </w:r>
+      <w:r>
+        <w:t>:</w:t>
+      </w:r>
+    </w:p>
+    <w:p>
+      <w:pPr>
+        <w:pStyle w:val="ListParagraph"/>
+        <w:numPr>
+          <w:ilvl w:val="0"/>
+          <w:numId w:val="18"/>
+        </w:numPr>
+      </w:pPr>
+      <w:r>
+        <w:t xml:space="preserve">Design and implement a cloud-based SaaS learning platform by the third quarter of 2026, enabling access to </w:t>
+      </w:r>
+      <w:proofErr w:type="spellStart"/>
+      <w:r>
+        <w:t>Worlducation's</w:t>
+      </w:r>
+      <w:proofErr w:type="spellEnd"/>
+      <w:r>
+        <w:t xml:space="preserve"> AI-powered educational software from any internet-connected device, eliminating dependence on proprietary tablet hardware and resolving the supply chain disruption that caused the shortfall of 1,500 tablets in 2020.</w:t>
+      </w:r>
+    </w:p>
+    <w:p>
+      <w:pPr>
+        <w:pStyle w:val="ListParagraph"/>
+        <w:numPr>
+          <w:ilvl w:val="0"/>
+          <w:numId w:val="18"/>
+        </w:numPr>
+      </w:pPr>
+      <w:r>
+        <w:t xml:space="preserve">Establish and launch a B2C subscription model by the fourth quarter of 2026, generating a minimum recurring annual revenue of $10 million from individual consumer subscriptions, contributing to the restoration of </w:t>
+      </w:r>
+      <w:proofErr w:type="spellStart"/>
+      <w:r>
+        <w:t>Worlducation's</w:t>
+      </w:r>
+      <w:proofErr w:type="spellEnd"/>
+      <w:r>
+        <w:t xml:space="preserve"> target net profit margin of at least 10% annually, in line with the organization's 2020–2022 Strategic Plan.</w:t>
+      </w:r>
+    </w:p>
+    <w:p>
+      <w:r>
+        <w:br w:type="page"/>
+      </w:r>
+    </w:p>
+    <w:p>
+      <w:pPr>
+        <w:rPr>
+          <w:b/>
+          <w:bCs/>
+        </w:rPr>
+      </w:pPr>
+      <w:r>
+        <w:rPr>
+          <w:b/>
+          <w:bCs/>
+        </w:rPr>
+        <w:lastRenderedPageBreak/>
+        <w:t>Strategic Hardware Partnerships and Outsourced Distribution</w:t>
+      </w:r>
+    </w:p>
+    <w:p>
+      <w:pPr>
+        <w:rPr>
+          <w:b/>
+          <w:bCs/>
+        </w:rPr>
+      </w:pPr>
+    </w:p>
+    <w:p>
+      <w:r>
+        <w:t>This is a Supply Chain Transformation / Strategic Acquisition and Distribution of ICT Hardware</w:t>
+      </w:r>
+      <w:r>
+        <w:t>.</w:t>
+      </w:r>
+    </w:p>
+    <w:p/>
+    <w:p>
+      <w:r>
+        <w:t xml:space="preserve">This initiative proposes establishing formal alliances with external hardware manufacturers and distribution providers to replace </w:t>
+      </w:r>
+      <w:proofErr w:type="spellStart"/>
+      <w:r>
+        <w:t>Worlducation's</w:t>
+      </w:r>
+      <w:proofErr w:type="spellEnd"/>
+      <w:r>
+        <w:t xml:space="preserve"> dependence on its single factory in Hong Kong.</w:t>
+      </w:r>
+    </w:p>
+    <w:p>
+      <w:r>
+        <w:t xml:space="preserve">Under this model, Worlducation would continue to deliver its proprietary software and content with artificial intelligence, licensing it or pre-installing it on tablets acquired and distributed by strategic partners. The initiative involves identifying and selecting qualified hardware partners, negotiating agreements with defined service level commitments, integrating partners' systems with </w:t>
+      </w:r>
+      <w:proofErr w:type="spellStart"/>
+      <w:r>
+        <w:t>Worlducation's</w:t>
+      </w:r>
+      <w:proofErr w:type="spellEnd"/>
+      <w:r>
+        <w:t xml:space="preserve"> ERP, and establishing a scalable, third-party distribution network.</w:t>
+      </w:r>
+    </w:p>
+    <w:p>
+      <w:r>
+        <w:t>From a financial perspective, the outsourcing model implies a lost margin of $200 per unit sold ($2 million annually at 10,000 units). However, it significantly reduces capital expenditure, eliminates the risk of single-source manufacturing, and shortens the path to fulfilling backorders. Compared to establishing a second manufacturing plant for $5 million, this approach is considerably more cost-effective in the short and medium term.</w:t>
+      </w:r>
+    </w:p>
+    <w:p/>
+    <w:p>
+      <w:pPr>
+        <w:rPr>
+          <w:b/>
+          <w:bCs/>
+        </w:rPr>
+      </w:pPr>
+      <w:r>
+        <w:rPr>
+          <w:b/>
+          <w:bCs/>
+        </w:rPr>
+        <w:t>PESLE Analysis</w:t>
+      </w:r>
+    </w:p>
     <w:p/>
     <w:sectPr>
       <w:pgSz w:w="11906" w:h="16838"/>
-      <w:pgMar w:top="1440" w:right="1440" w:bottom="1440" w:left="1440" w:header="708" w:footer="708" w:gutter="0"/>
+      <w:pgMar w:top="720" w:right="720" w:bottom="720" w:left="720" w:header="708" w:footer="708" w:gutter="0"/>
       <w:cols w:space="708"/>
       <w:docGrid w:linePitch="360"/>
     </w:sectPr>
   </w:body>
 </w:document>
+</file>
+
+<file path=word/numbering.xml><?xml version="1.0" encoding="utf-8"?>
+<w:numbering xmlns:wpc="http://schemas.microsoft.com/office/word/2010/wordprocessingCanvas" xmlns:cx="http://schemas.microsoft.com/office/drawing/2014/chartex" xmlns:cx1="http://schemas.microsoft.com/office/drawing/2015/9/8/chartex" xmlns:cx2="http://schemas.microsoft.com/office/drawing/2015/10/21/chartex" xmlns:cx3="http://schemas.microsoft.com/office/drawing/2016/5/9/chartex" xmlns:cx4="http://schemas.microsoft.com/office/drawing/2016/5/10/chartex" xmlns:cx5="http://schemas.microsoft.com/office/drawing/2016/5/11/chartex" xmlns:cx6="http://schemas.microsoft.com/office/drawing/2016/5/12/chartex" xmlns:cx7="http://schemas.microsoft.com/office/drawing/2016/5/13/chartex" xmlns:cx8="http://schemas.microsoft.com/office/drawing/2016/5/14/chartex" xmlns:mc="http://schemas.openxmlformats.org/markup-compatibility/2006" xmlns:m="http://schemas.openxmlformats.org/officeDocument/2006/math" xmlns:aink="http://schemas.microsoft.com/office/drawing/2016/ink" xmlns:am3d="http://schemas.microsoft.com/office/drawing/2017/model3d" xmlns:oel="http://schemas.microsoft.com/office/2019/extlst" xmlns:r="http://schemas.openxmlformats.org/officeDocument/2006/relationships" xmlns:wp14="http://schemas.microsoft.com/office/word/2010/wordprocessingDrawing" xmlns:wp="http://schemas.openxmlformats.org/drawingml/2006/wordprocessingDrawing" xmlns:wpg="http://schemas.microsoft.com/office/word/2010/wordprocessingGroup" xmlns:wpi="http://schemas.microsoft.com/office/word/2010/wordprocessingInk" xmlns:wps="http://schemas.microsoft.com/office/word/2010/wordprocessingShape" xmlns:o="urn:schemas-microsoft-com:office:office" xmlns:v="urn:schemas-microsoft-com:vml" xmlns:w10="urn:schemas-microsoft-com:office:word" xmlns:w="http://schemas.openxmlformats.org/wordprocessingml/2006/main" xmlns:w14="http://schemas.microsoft.com/office/word/2010/wordml" xmlns:w15="http://schemas.microsoft.com/office/word/2012/wordml" xmlns:w16cex="http://schemas.microsoft.com/office/word/2018/wordml/cex" xmlns:w16cid="http://schemas.microsoft.com/office/word/2016/wordml/cid" xmlns:w16="http://schemas.microsoft.com/office/word/2018/wordml" xmlns:w16sdtdh="http://schemas.microsoft.com/office/word/2020/wordml/sdtdatahash" xmlns:w16sdtfl="http://schemas.microsoft.com/office/word/2024/wordml/sdtformatlock" xmlns:w16se="http://schemas.microsoft.com/office/word/2015/wordml/symex" xmlns:w16du="http://schemas.microsoft.com/office/word/2023/wordml/word16du" xmlns:wne="http://schemas.microsoft.com/office/word/2006/wordml" mc:Ignorable="w14 w15 w16se w16cid w16 w16cex w16sdtdh w16sdtfl w16du wp14">
+  <w:abstractNum w:abstractNumId="0" w15:restartNumberingAfterBreak="0">
+    <w:nsid w:val="0D7320FB"/>
+    <w:multiLevelType w:val="multilevel"/>
+    <w:tmpl w:val="CD941F0A"/>
+    <w:lvl w:ilvl="0">
+      <w:start w:val="1"/>
+      <w:numFmt w:val="bullet"/>
+      <w:lvlText w:val=""/>
+      <w:lvlJc w:val="left"/>
+      <w:pPr>
+        <w:tabs>
+          <w:tab w:val="num" w:pos="720"/>
+        </w:tabs>
+        <w:ind w:left="720" w:hanging="360"/>
+      </w:pPr>
+      <w:rPr>
+        <w:rFonts w:ascii="Symbol" w:hAnsi="Symbol" w:hint="default"/>
+        <w:sz w:val="20"/>
+      </w:rPr>
+    </w:lvl>
+    <w:lvl w:ilvl="1">
+      <w:start w:val="1"/>
+      <w:numFmt w:val="bullet"/>
+      <w:lvlText w:val="o"/>
+      <w:lvlJc w:val="left"/>
+      <w:pPr>
+        <w:tabs>
+          <w:tab w:val="num" w:pos="1440"/>
+        </w:tabs>
+        <w:ind w:left="1440" w:hanging="360"/>
+      </w:pPr>
+      <w:rPr>
+        <w:rFonts w:ascii="Courier New" w:hAnsi="Courier New" w:hint="default"/>
+        <w:sz w:val="20"/>
+      </w:rPr>
+    </w:lvl>
+    <w:lvl w:ilvl="2" w:tentative="1">
+      <w:start w:val="1"/>
+      <w:numFmt w:val="bullet"/>
+      <w:lvlText w:val=""/>
+      <w:lvlJc w:val="left"/>
+      <w:pPr>
+        <w:tabs>
+          <w:tab w:val="num" w:pos="2160"/>
+        </w:tabs>
+        <w:ind w:left="2160" w:hanging="360"/>
+      </w:pPr>
+      <w:rPr>
+        <w:rFonts w:ascii="Wingdings" w:hAnsi="Wingdings" w:hint="default"/>
+        <w:sz w:val="20"/>
+      </w:rPr>
+    </w:lvl>
+    <w:lvl w:ilvl="3" w:tentative="1">
+      <w:start w:val="1"/>
+      <w:numFmt w:val="bullet"/>
+      <w:lvlText w:val=""/>
+      <w:lvlJc w:val="left"/>
+      <w:pPr>
+        <w:tabs>
+          <w:tab w:val="num" w:pos="2880"/>
+        </w:tabs>
+        <w:ind w:left="2880" w:hanging="360"/>
+      </w:pPr>
+      <w:rPr>
+        <w:rFonts w:ascii="Wingdings" w:hAnsi="Wingdings" w:hint="default"/>
+        <w:sz w:val="20"/>
+      </w:rPr>
+    </w:lvl>
+    <w:lvl w:ilvl="4" w:tentative="1">
+      <w:start w:val="1"/>
+      <w:numFmt w:val="bullet"/>
+      <w:lvlText w:val=""/>
+      <w:lvlJc w:val="left"/>
+      <w:pPr>
+        <w:tabs>
+          <w:tab w:val="num" w:pos="3600"/>
+        </w:tabs>
+        <w:ind w:left="3600" w:hanging="360"/>
+      </w:pPr>
+      <w:rPr>
+        <w:rFonts w:ascii="Wingdings" w:hAnsi="Wingdings" w:hint="default"/>
+        <w:sz w:val="20"/>
+      </w:rPr>
+    </w:lvl>
+    <w:lvl w:ilvl="5" w:tentative="1">
+      <w:start w:val="1"/>
+      <w:numFmt w:val="bullet"/>
+      <w:lvlText w:val=""/>
+      <w:lvlJc w:val="left"/>
+      <w:pPr>
+        <w:tabs>
+          <w:tab w:val="num" w:pos="4320"/>
+        </w:tabs>
+        <w:ind w:left="4320" w:hanging="360"/>
+      </w:pPr>
+      <w:rPr>
+        <w:rFonts w:ascii="Wingdings" w:hAnsi="Wingdings" w:hint="default"/>
+        <w:sz w:val="20"/>
+      </w:rPr>
+    </w:lvl>
+    <w:lvl w:ilvl="6" w:tentative="1">
+      <w:start w:val="1"/>
+      <w:numFmt w:val="bullet"/>
+      <w:lvlText w:val=""/>
+      <w:lvlJc w:val="left"/>
+      <w:pPr>
+        <w:tabs>
+          <w:tab w:val="num" w:pos="5040"/>
+        </w:tabs>
+        <w:ind w:left="5040" w:hanging="360"/>
+      </w:pPr>
+      <w:rPr>
+        <w:rFonts w:ascii="Wingdings" w:hAnsi="Wingdings" w:hint="default"/>
+        <w:sz w:val="20"/>
+      </w:rPr>
+    </w:lvl>
+    <w:lvl w:ilvl="7" w:tentative="1">
+      <w:start w:val="1"/>
+      <w:numFmt w:val="bullet"/>
+      <w:lvlText w:val=""/>
+      <w:lvlJc w:val="left"/>
+      <w:pPr>
+        <w:tabs>
+          <w:tab w:val="num" w:pos="5760"/>
+        </w:tabs>
+        <w:ind w:left="5760" w:hanging="360"/>
+      </w:pPr>
+      <w:rPr>
+        <w:rFonts w:ascii="Wingdings" w:hAnsi="Wingdings" w:hint="default"/>
+        <w:sz w:val="20"/>
+      </w:rPr>
+    </w:lvl>
+    <w:lvl w:ilvl="8" w:tentative="1">
+      <w:start w:val="1"/>
+      <w:numFmt w:val="bullet"/>
+      <w:lvlText w:val=""/>
+      <w:lvlJc w:val="left"/>
+      <w:pPr>
+        <w:tabs>
+          <w:tab w:val="num" w:pos="6480"/>
+        </w:tabs>
+        <w:ind w:left="6480" w:hanging="360"/>
+      </w:pPr>
+      <w:rPr>
+        <w:rFonts w:ascii="Wingdings" w:hAnsi="Wingdings" w:hint="default"/>
+        <w:sz w:val="20"/>
+      </w:rPr>
+    </w:lvl>
+  </w:abstractNum>
+  <w:abstractNum w:abstractNumId="1" w15:restartNumberingAfterBreak="0">
+    <w:nsid w:val="113C59F1"/>
+    <w:multiLevelType w:val="multilevel"/>
+    <w:tmpl w:val="66D8D3C4"/>
+    <w:lvl w:ilvl="0">
+      <w:start w:val="1"/>
+      <w:numFmt w:val="bullet"/>
+      <w:lvlText w:val=""/>
+      <w:lvlJc w:val="left"/>
+      <w:pPr>
+        <w:tabs>
+          <w:tab w:val="num" w:pos="720"/>
+        </w:tabs>
+        <w:ind w:left="720" w:hanging="360"/>
+      </w:pPr>
+      <w:rPr>
+        <w:rFonts w:ascii="Symbol" w:hAnsi="Symbol" w:hint="default"/>
+        <w:sz w:val="20"/>
+      </w:rPr>
+    </w:lvl>
+    <w:lvl w:ilvl="1" w:tentative="1">
+      <w:start w:val="1"/>
+      <w:numFmt w:val="bullet"/>
+      <w:lvlText w:val="o"/>
+      <w:lvlJc w:val="left"/>
+      <w:pPr>
+        <w:tabs>
+          <w:tab w:val="num" w:pos="1440"/>
+        </w:tabs>
+        <w:ind w:left="1440" w:hanging="360"/>
+      </w:pPr>
+      <w:rPr>
+        <w:rFonts w:ascii="Courier New" w:hAnsi="Courier New" w:hint="default"/>
+        <w:sz w:val="20"/>
+      </w:rPr>
+    </w:lvl>
+    <w:lvl w:ilvl="2" w:tentative="1">
+      <w:start w:val="1"/>
+      <w:numFmt w:val="bullet"/>
+      <w:lvlText w:val=""/>
+      <w:lvlJc w:val="left"/>
+      <w:pPr>
+        <w:tabs>
+          <w:tab w:val="num" w:pos="2160"/>
+        </w:tabs>
+        <w:ind w:left="2160" w:hanging="360"/>
+      </w:pPr>
+      <w:rPr>
+        <w:rFonts w:ascii="Wingdings" w:hAnsi="Wingdings" w:hint="default"/>
+        <w:sz w:val="20"/>
+      </w:rPr>
+    </w:lvl>
+    <w:lvl w:ilvl="3" w:tentative="1">
+      <w:start w:val="1"/>
+      <w:numFmt w:val="bullet"/>
+      <w:lvlText w:val=""/>
+      <w:lvlJc w:val="left"/>
+      <w:pPr>
+        <w:tabs>
+          <w:tab w:val="num" w:pos="2880"/>
+        </w:tabs>
+        <w:ind w:left="2880" w:hanging="360"/>
+      </w:pPr>
+      <w:rPr>
+        <w:rFonts w:ascii="Wingdings" w:hAnsi="Wingdings" w:hint="default"/>
+        <w:sz w:val="20"/>
+      </w:rPr>
+    </w:lvl>
+    <w:lvl w:ilvl="4" w:tentative="1">
+      <w:start w:val="1"/>
+      <w:numFmt w:val="bullet"/>
+      <w:lvlText w:val=""/>
+      <w:lvlJc w:val="left"/>
+      <w:pPr>
+        <w:tabs>
+          <w:tab w:val="num" w:pos="3600"/>
+        </w:tabs>
+        <w:ind w:left="3600" w:hanging="360"/>
+      </w:pPr>
+      <w:rPr>
+        <w:rFonts w:ascii="Wingdings" w:hAnsi="Wingdings" w:hint="default"/>
+        <w:sz w:val="20"/>
+      </w:rPr>
+    </w:lvl>
+    <w:lvl w:ilvl="5" w:tentative="1">
+      <w:start w:val="1"/>
+      <w:numFmt w:val="bullet"/>
+      <w:lvlText w:val=""/>
+      <w:lvlJc w:val="left"/>
+      <w:pPr>
+        <w:tabs>
+          <w:tab w:val="num" w:pos="4320"/>
+        </w:tabs>
+        <w:ind w:left="4320" w:hanging="360"/>
+      </w:pPr>
+      <w:rPr>
+        <w:rFonts w:ascii="Wingdings" w:hAnsi="Wingdings" w:hint="default"/>
+        <w:sz w:val="20"/>
+      </w:rPr>
+    </w:lvl>
+    <w:lvl w:ilvl="6" w:tentative="1">
+      <w:start w:val="1"/>
+      <w:numFmt w:val="bullet"/>
+      <w:lvlText w:val=""/>
+      <w:lvlJc w:val="left"/>
+      <w:pPr>
+        <w:tabs>
+          <w:tab w:val="num" w:pos="5040"/>
+        </w:tabs>
+        <w:ind w:left="5040" w:hanging="360"/>
+      </w:pPr>
+      <w:rPr>
+        <w:rFonts w:ascii="Wingdings" w:hAnsi="Wingdings" w:hint="default"/>
+        <w:sz w:val="20"/>
+      </w:rPr>
+    </w:lvl>
+    <w:lvl w:ilvl="7" w:tentative="1">
+      <w:start w:val="1"/>
+      <w:numFmt w:val="bullet"/>
+      <w:lvlText w:val=""/>
+      <w:lvlJc w:val="left"/>
+      <w:pPr>
+        <w:tabs>
+          <w:tab w:val="num" w:pos="5760"/>
+        </w:tabs>
+        <w:ind w:left="5760" w:hanging="360"/>
+      </w:pPr>
+      <w:rPr>
+        <w:rFonts w:ascii="Wingdings" w:hAnsi="Wingdings" w:hint="default"/>
+        <w:sz w:val="20"/>
+      </w:rPr>
+    </w:lvl>
+    <w:lvl w:ilvl="8" w:tentative="1">
+      <w:start w:val="1"/>
+      <w:numFmt w:val="bullet"/>
+      <w:lvlText w:val=""/>
+      <w:lvlJc w:val="left"/>
+      <w:pPr>
+        <w:tabs>
+          <w:tab w:val="num" w:pos="6480"/>
+        </w:tabs>
+        <w:ind w:left="6480" w:hanging="360"/>
+      </w:pPr>
+      <w:rPr>
+        <w:rFonts w:ascii="Wingdings" w:hAnsi="Wingdings" w:hint="default"/>
+        <w:sz w:val="20"/>
+      </w:rPr>
+    </w:lvl>
+  </w:abstractNum>
+  <w:abstractNum w:abstractNumId="2" w15:restartNumberingAfterBreak="0">
+    <w:nsid w:val="1B890B33"/>
+    <w:multiLevelType w:val="multilevel"/>
+    <w:tmpl w:val="9A761358"/>
+    <w:lvl w:ilvl="0">
+      <w:start w:val="1"/>
+      <w:numFmt w:val="bullet"/>
+      <w:lvlText w:val=""/>
+      <w:lvlJc w:val="left"/>
+      <w:pPr>
+        <w:tabs>
+          <w:tab w:val="num" w:pos="720"/>
+        </w:tabs>
+        <w:ind w:left="720" w:hanging="360"/>
+      </w:pPr>
+      <w:rPr>
+        <w:rFonts w:ascii="Symbol" w:hAnsi="Symbol" w:hint="default"/>
+        <w:sz w:val="20"/>
+      </w:rPr>
+    </w:lvl>
+    <w:lvl w:ilvl="1">
+      <w:start w:val="1"/>
+      <w:numFmt w:val="bullet"/>
+      <w:lvlText w:val="o"/>
+      <w:lvlJc w:val="left"/>
+      <w:pPr>
+        <w:tabs>
+          <w:tab w:val="num" w:pos="1440"/>
+        </w:tabs>
+        <w:ind w:left="1440" w:hanging="360"/>
+      </w:pPr>
+      <w:rPr>
+        <w:rFonts w:ascii="Courier New" w:hAnsi="Courier New" w:hint="default"/>
+        <w:sz w:val="20"/>
+      </w:rPr>
+    </w:lvl>
+    <w:lvl w:ilvl="2" w:tentative="1">
+      <w:start w:val="1"/>
+      <w:numFmt w:val="bullet"/>
+      <w:lvlText w:val=""/>
+      <w:lvlJc w:val="left"/>
+      <w:pPr>
+        <w:tabs>
+          <w:tab w:val="num" w:pos="2160"/>
+        </w:tabs>
+        <w:ind w:left="2160" w:hanging="360"/>
+      </w:pPr>
+      <w:rPr>
+        <w:rFonts w:ascii="Wingdings" w:hAnsi="Wingdings" w:hint="default"/>
+        <w:sz w:val="20"/>
+      </w:rPr>
+    </w:lvl>
+    <w:lvl w:ilvl="3" w:tentative="1">
+      <w:start w:val="1"/>
+      <w:numFmt w:val="bullet"/>
+      <w:lvlText w:val=""/>
+      <w:lvlJc w:val="left"/>
+      <w:pPr>
+        <w:tabs>
+          <w:tab w:val="num" w:pos="2880"/>
+        </w:tabs>
+        <w:ind w:left="2880" w:hanging="360"/>
+      </w:pPr>
+      <w:rPr>
+        <w:rFonts w:ascii="Wingdings" w:hAnsi="Wingdings" w:hint="default"/>
+        <w:sz w:val="20"/>
+      </w:rPr>
+    </w:lvl>
+    <w:lvl w:ilvl="4" w:tentative="1">
+      <w:start w:val="1"/>
+      <w:numFmt w:val="bullet"/>
+      <w:lvlText w:val=""/>
+      <w:lvlJc w:val="left"/>
+      <w:pPr>
+        <w:tabs>
+          <w:tab w:val="num" w:pos="3600"/>
+        </w:tabs>
+        <w:ind w:left="3600" w:hanging="360"/>
+      </w:pPr>
+      <w:rPr>
+        <w:rFonts w:ascii="Wingdings" w:hAnsi="Wingdings" w:hint="default"/>
+        <w:sz w:val="20"/>
+      </w:rPr>
+    </w:lvl>
+    <w:lvl w:ilvl="5" w:tentative="1">
+      <w:start w:val="1"/>
+      <w:numFmt w:val="bullet"/>
+      <w:lvlText w:val=""/>
+      <w:lvlJc w:val="left"/>
+      <w:pPr>
+        <w:tabs>
+          <w:tab w:val="num" w:pos="4320"/>
+        </w:tabs>
+        <w:ind w:left="4320" w:hanging="360"/>
+      </w:pPr>
+      <w:rPr>
+        <w:rFonts w:ascii="Wingdings" w:hAnsi="Wingdings" w:hint="default"/>
+        <w:sz w:val="20"/>
+      </w:rPr>
+    </w:lvl>
+    <w:lvl w:ilvl="6" w:tentative="1">
+      <w:start w:val="1"/>
+      <w:numFmt w:val="bullet"/>
+      <w:lvlText w:val=""/>
+      <w:lvlJc w:val="left"/>
+      <w:pPr>
+        <w:tabs>
+          <w:tab w:val="num" w:pos="5040"/>
+        </w:tabs>
+        <w:ind w:left="5040" w:hanging="360"/>
+      </w:pPr>
+      <w:rPr>
+        <w:rFonts w:ascii="Wingdings" w:hAnsi="Wingdings" w:hint="default"/>
+        <w:sz w:val="20"/>
+      </w:rPr>
+    </w:lvl>
+    <w:lvl w:ilvl="7" w:tentative="1">
+      <w:start w:val="1"/>
+      <w:numFmt w:val="bullet"/>
+      <w:lvlText w:val=""/>
+      <w:lvlJc w:val="left"/>
+      <w:pPr>
+        <w:tabs>
+          <w:tab w:val="num" w:pos="5760"/>
+        </w:tabs>
+        <w:ind w:left="5760" w:hanging="360"/>
+      </w:pPr>
+      <w:rPr>
+        <w:rFonts w:ascii="Wingdings" w:hAnsi="Wingdings" w:hint="default"/>
+        <w:sz w:val="20"/>
+      </w:rPr>
+    </w:lvl>
+    <w:lvl w:ilvl="8" w:tentative="1">
+      <w:start w:val="1"/>
+      <w:numFmt w:val="bullet"/>
+      <w:lvlText w:val=""/>
+      <w:lvlJc w:val="left"/>
+      <w:pPr>
+        <w:tabs>
+          <w:tab w:val="num" w:pos="6480"/>
+        </w:tabs>
+        <w:ind w:left="6480" w:hanging="360"/>
+      </w:pPr>
+      <w:rPr>
+        <w:rFonts w:ascii="Wingdings" w:hAnsi="Wingdings" w:hint="default"/>
+        <w:sz w:val="20"/>
+      </w:rPr>
+    </w:lvl>
+  </w:abstractNum>
+  <w:abstractNum w:abstractNumId="3" w15:restartNumberingAfterBreak="0">
+    <w:nsid w:val="1E526D28"/>
+    <w:multiLevelType w:val="multilevel"/>
+    <w:tmpl w:val="E61E96DA"/>
+    <w:lvl w:ilvl="0">
+      <w:start w:val="1"/>
+      <w:numFmt w:val="bullet"/>
+      <w:lvlText w:val=""/>
+      <w:lvlJc w:val="left"/>
+      <w:pPr>
+        <w:tabs>
+          <w:tab w:val="num" w:pos="720"/>
+        </w:tabs>
+        <w:ind w:left="720" w:hanging="360"/>
+      </w:pPr>
+      <w:rPr>
+        <w:rFonts w:ascii="Symbol" w:hAnsi="Symbol" w:hint="default"/>
+        <w:sz w:val="20"/>
+      </w:rPr>
+    </w:lvl>
+    <w:lvl w:ilvl="1" w:tentative="1">
+      <w:start w:val="1"/>
+      <w:numFmt w:val="bullet"/>
+      <w:lvlText w:val="o"/>
+      <w:lvlJc w:val="left"/>
+      <w:pPr>
+        <w:tabs>
+          <w:tab w:val="num" w:pos="1440"/>
+        </w:tabs>
+        <w:ind w:left="1440" w:hanging="360"/>
+      </w:pPr>
+      <w:rPr>
+        <w:rFonts w:ascii="Courier New" w:hAnsi="Courier New" w:hint="default"/>
+        <w:sz w:val="20"/>
+      </w:rPr>
+    </w:lvl>
+    <w:lvl w:ilvl="2" w:tentative="1">
+      <w:start w:val="1"/>
+      <w:numFmt w:val="bullet"/>
+      <w:lvlText w:val=""/>
+      <w:lvlJc w:val="left"/>
+      <w:pPr>
+        <w:tabs>
+          <w:tab w:val="num" w:pos="2160"/>
+        </w:tabs>
+        <w:ind w:left="2160" w:hanging="360"/>
+      </w:pPr>
+      <w:rPr>
+        <w:rFonts w:ascii="Wingdings" w:hAnsi="Wingdings" w:hint="default"/>
+        <w:sz w:val="20"/>
+      </w:rPr>
+    </w:lvl>
+    <w:lvl w:ilvl="3" w:tentative="1">
+      <w:start w:val="1"/>
+      <w:numFmt w:val="bullet"/>
+      <w:lvlText w:val=""/>
+      <w:lvlJc w:val="left"/>
+      <w:pPr>
+        <w:tabs>
+          <w:tab w:val="num" w:pos="2880"/>
+        </w:tabs>
+        <w:ind w:left="2880" w:hanging="360"/>
+      </w:pPr>
+      <w:rPr>
+        <w:rFonts w:ascii="Wingdings" w:hAnsi="Wingdings" w:hint="default"/>
+        <w:sz w:val="20"/>
+      </w:rPr>
+    </w:lvl>
+    <w:lvl w:ilvl="4" w:tentative="1">
+      <w:start w:val="1"/>
+      <w:numFmt w:val="bullet"/>
+      <w:lvlText w:val=""/>
+      <w:lvlJc w:val="left"/>
+      <w:pPr>
+        <w:tabs>
+          <w:tab w:val="num" w:pos="3600"/>
+        </w:tabs>
+        <w:ind w:left="3600" w:hanging="360"/>
+      </w:pPr>
+      <w:rPr>
+        <w:rFonts w:ascii="Wingdings" w:hAnsi="Wingdings" w:hint="default"/>
+        <w:sz w:val="20"/>
+      </w:rPr>
+    </w:lvl>
+    <w:lvl w:ilvl="5" w:tentative="1">
+      <w:start w:val="1"/>
+      <w:numFmt w:val="bullet"/>
+      <w:lvlText w:val=""/>
+      <w:lvlJc w:val="left"/>
+      <w:pPr>
+        <w:tabs>
+          <w:tab w:val="num" w:pos="4320"/>
+        </w:tabs>
+        <w:ind w:left="4320" w:hanging="360"/>
+      </w:pPr>
+      <w:rPr>
+        <w:rFonts w:ascii="Wingdings" w:hAnsi="Wingdings" w:hint="default"/>
+        <w:sz w:val="20"/>
+      </w:rPr>
+    </w:lvl>
+    <w:lvl w:ilvl="6" w:tentative="1">
+      <w:start w:val="1"/>
+      <w:numFmt w:val="bullet"/>
+      <w:lvlText w:val=""/>
+      <w:lvlJc w:val="left"/>
+      <w:pPr>
+        <w:tabs>
+          <w:tab w:val="num" w:pos="5040"/>
+        </w:tabs>
+        <w:ind w:left="5040" w:hanging="360"/>
+      </w:pPr>
+      <w:rPr>
+        <w:rFonts w:ascii="Wingdings" w:hAnsi="Wingdings" w:hint="default"/>
+        <w:sz w:val="20"/>
+      </w:rPr>
+    </w:lvl>
+    <w:lvl w:ilvl="7" w:tentative="1">
+      <w:start w:val="1"/>
+      <w:numFmt w:val="bullet"/>
+      <w:lvlText w:val=""/>
+      <w:lvlJc w:val="left"/>
+      <w:pPr>
+        <w:tabs>
+          <w:tab w:val="num" w:pos="5760"/>
+        </w:tabs>
+        <w:ind w:left="5760" w:hanging="360"/>
+      </w:pPr>
+      <w:rPr>
+        <w:rFonts w:ascii="Wingdings" w:hAnsi="Wingdings" w:hint="default"/>
+        <w:sz w:val="20"/>
+      </w:rPr>
+    </w:lvl>
+    <w:lvl w:ilvl="8" w:tentative="1">
+      <w:start w:val="1"/>
+      <w:numFmt w:val="bullet"/>
+      <w:lvlText w:val=""/>
+      <w:lvlJc w:val="left"/>
+      <w:pPr>
+        <w:tabs>
+          <w:tab w:val="num" w:pos="6480"/>
+        </w:tabs>
+        <w:ind w:left="6480" w:hanging="360"/>
+      </w:pPr>
+      <w:rPr>
+        <w:rFonts w:ascii="Wingdings" w:hAnsi="Wingdings" w:hint="default"/>
+        <w:sz w:val="20"/>
+      </w:rPr>
+    </w:lvl>
+  </w:abstractNum>
+  <w:abstractNum w:abstractNumId="4" w15:restartNumberingAfterBreak="0">
+    <w:nsid w:val="291B1D4C"/>
+    <w:multiLevelType w:val="multilevel"/>
+    <w:tmpl w:val="25A8E8A2"/>
+    <w:lvl w:ilvl="0">
+      <w:start w:val="1"/>
+      <w:numFmt w:val="bullet"/>
+      <w:lvlText w:val=""/>
+      <w:lvlJc w:val="left"/>
+      <w:pPr>
+        <w:tabs>
+          <w:tab w:val="num" w:pos="720"/>
+        </w:tabs>
+        <w:ind w:left="720" w:hanging="360"/>
+      </w:pPr>
+      <w:rPr>
+        <w:rFonts w:ascii="Symbol" w:hAnsi="Symbol" w:hint="default"/>
+        <w:sz w:val="20"/>
+      </w:rPr>
+    </w:lvl>
+    <w:lvl w:ilvl="1" w:tentative="1">
+      <w:start w:val="1"/>
+      <w:numFmt w:val="bullet"/>
+      <w:lvlText w:val="o"/>
+      <w:lvlJc w:val="left"/>
+      <w:pPr>
+        <w:tabs>
+          <w:tab w:val="num" w:pos="1440"/>
+        </w:tabs>
+        <w:ind w:left="1440" w:hanging="360"/>
+      </w:pPr>
+      <w:rPr>
+        <w:rFonts w:ascii="Courier New" w:hAnsi="Courier New" w:hint="default"/>
+        <w:sz w:val="20"/>
+      </w:rPr>
+    </w:lvl>
+    <w:lvl w:ilvl="2" w:tentative="1">
+      <w:start w:val="1"/>
+      <w:numFmt w:val="bullet"/>
+      <w:lvlText w:val=""/>
+      <w:lvlJc w:val="left"/>
+      <w:pPr>
+        <w:tabs>
+          <w:tab w:val="num" w:pos="2160"/>
+        </w:tabs>
+        <w:ind w:left="2160" w:hanging="360"/>
+      </w:pPr>
+      <w:rPr>
+        <w:rFonts w:ascii="Wingdings" w:hAnsi="Wingdings" w:hint="default"/>
+        <w:sz w:val="20"/>
+      </w:rPr>
+    </w:lvl>
+    <w:lvl w:ilvl="3" w:tentative="1">
+      <w:start w:val="1"/>
+      <w:numFmt w:val="bullet"/>
+      <w:lvlText w:val=""/>
+      <w:lvlJc w:val="left"/>
+      <w:pPr>
+        <w:tabs>
+          <w:tab w:val="num" w:pos="2880"/>
+        </w:tabs>
+        <w:ind w:left="2880" w:hanging="360"/>
+      </w:pPr>
+      <w:rPr>
+        <w:rFonts w:ascii="Wingdings" w:hAnsi="Wingdings" w:hint="default"/>
+        <w:sz w:val="20"/>
+      </w:rPr>
+    </w:lvl>
+    <w:lvl w:ilvl="4" w:tentative="1">
+      <w:start w:val="1"/>
+      <w:numFmt w:val="bullet"/>
+      <w:lvlText w:val=""/>
+      <w:lvlJc w:val="left"/>
+      <w:pPr>
+        <w:tabs>
+          <w:tab w:val="num" w:pos="3600"/>
+        </w:tabs>
+        <w:ind w:left="3600" w:hanging="360"/>
+      </w:pPr>
+      <w:rPr>
+        <w:rFonts w:ascii="Wingdings" w:hAnsi="Wingdings" w:hint="default"/>
+        <w:sz w:val="20"/>
+      </w:rPr>
+    </w:lvl>
+    <w:lvl w:ilvl="5" w:tentative="1">
+      <w:start w:val="1"/>
+      <w:numFmt w:val="bullet"/>
+      <w:lvlText w:val=""/>
+      <w:lvlJc w:val="left"/>
+      <w:pPr>
+        <w:tabs>
+          <w:tab w:val="num" w:pos="4320"/>
+        </w:tabs>
+        <w:ind w:left="4320" w:hanging="360"/>
+      </w:pPr>
+      <w:rPr>
+        <w:rFonts w:ascii="Wingdings" w:hAnsi="Wingdings" w:hint="default"/>
+        <w:sz w:val="20"/>
+      </w:rPr>
+    </w:lvl>
+    <w:lvl w:ilvl="6" w:tentative="1">
+      <w:start w:val="1"/>
+      <w:numFmt w:val="bullet"/>
+      <w:lvlText w:val=""/>
+      <w:lvlJc w:val="left"/>
+      <w:pPr>
+        <w:tabs>
+          <w:tab w:val="num" w:pos="5040"/>
+        </w:tabs>
+        <w:ind w:left="5040" w:hanging="360"/>
+      </w:pPr>
+      <w:rPr>
+        <w:rFonts w:ascii="Wingdings" w:hAnsi="Wingdings" w:hint="default"/>
+        <w:sz w:val="20"/>
+      </w:rPr>
+    </w:lvl>
+    <w:lvl w:ilvl="7" w:tentative="1">
+      <w:start w:val="1"/>
+      <w:numFmt w:val="bullet"/>
+      <w:lvlText w:val=""/>
+      <w:lvlJc w:val="left"/>
+      <w:pPr>
+        <w:tabs>
+          <w:tab w:val="num" w:pos="5760"/>
+        </w:tabs>
+        <w:ind w:left="5760" w:hanging="360"/>
+      </w:pPr>
+      <w:rPr>
+        <w:rFonts w:ascii="Wingdings" w:hAnsi="Wingdings" w:hint="default"/>
+        <w:sz w:val="20"/>
+      </w:rPr>
+    </w:lvl>
+    <w:lvl w:ilvl="8" w:tentative="1">
+      <w:start w:val="1"/>
+      <w:numFmt w:val="bullet"/>
+      <w:lvlText w:val=""/>
+      <w:lvlJc w:val="left"/>
+      <w:pPr>
+        <w:tabs>
+          <w:tab w:val="num" w:pos="6480"/>
+        </w:tabs>
+        <w:ind w:left="6480" w:hanging="360"/>
+      </w:pPr>
+      <w:rPr>
+        <w:rFonts w:ascii="Wingdings" w:hAnsi="Wingdings" w:hint="default"/>
+        <w:sz w:val="20"/>
+      </w:rPr>
+    </w:lvl>
+  </w:abstractNum>
+  <w:abstractNum w:abstractNumId="5" w15:restartNumberingAfterBreak="0">
+    <w:nsid w:val="2B2026EC"/>
+    <w:multiLevelType w:val="multilevel"/>
+    <w:tmpl w:val="A98CDBF2"/>
+    <w:lvl w:ilvl="0">
+      <w:start w:val="1"/>
+      <w:numFmt w:val="bullet"/>
+      <w:lvlText w:val=""/>
+      <w:lvlJc w:val="left"/>
+      <w:pPr>
+        <w:tabs>
+          <w:tab w:val="num" w:pos="720"/>
+        </w:tabs>
+        <w:ind w:left="720" w:hanging="360"/>
+      </w:pPr>
+      <w:rPr>
+        <w:rFonts w:ascii="Symbol" w:hAnsi="Symbol" w:hint="default"/>
+        <w:sz w:val="20"/>
+      </w:rPr>
+    </w:lvl>
+    <w:lvl w:ilvl="1" w:tentative="1">
+      <w:start w:val="1"/>
+      <w:numFmt w:val="bullet"/>
+      <w:lvlText w:val="o"/>
+      <w:lvlJc w:val="left"/>
+      <w:pPr>
+        <w:tabs>
+          <w:tab w:val="num" w:pos="1440"/>
+        </w:tabs>
+        <w:ind w:left="1440" w:hanging="360"/>
+      </w:pPr>
+      <w:rPr>
+        <w:rFonts w:ascii="Courier New" w:hAnsi="Courier New" w:hint="default"/>
+        <w:sz w:val="20"/>
+      </w:rPr>
+    </w:lvl>
+    <w:lvl w:ilvl="2" w:tentative="1">
+      <w:start w:val="1"/>
+      <w:numFmt w:val="bullet"/>
+      <w:lvlText w:val=""/>
+      <w:lvlJc w:val="left"/>
+      <w:pPr>
+        <w:tabs>
+          <w:tab w:val="num" w:pos="2160"/>
+        </w:tabs>
+        <w:ind w:left="2160" w:hanging="360"/>
+      </w:pPr>
+      <w:rPr>
+        <w:rFonts w:ascii="Wingdings" w:hAnsi="Wingdings" w:hint="default"/>
+        <w:sz w:val="20"/>
+      </w:rPr>
+    </w:lvl>
+    <w:lvl w:ilvl="3" w:tentative="1">
+      <w:start w:val="1"/>
+      <w:numFmt w:val="bullet"/>
+      <w:lvlText w:val=""/>
+      <w:lvlJc w:val="left"/>
+      <w:pPr>
+        <w:tabs>
+          <w:tab w:val="num" w:pos="2880"/>
+        </w:tabs>
+        <w:ind w:left="2880" w:hanging="360"/>
+      </w:pPr>
+      <w:rPr>
+        <w:rFonts w:ascii="Wingdings" w:hAnsi="Wingdings" w:hint="default"/>
+        <w:sz w:val="20"/>
+      </w:rPr>
+    </w:lvl>
+    <w:lvl w:ilvl="4" w:tentative="1">
+      <w:start w:val="1"/>
+      <w:numFmt w:val="bullet"/>
+      <w:lvlText w:val=""/>
+      <w:lvlJc w:val="left"/>
+      <w:pPr>
+        <w:tabs>
+          <w:tab w:val="num" w:pos="3600"/>
+        </w:tabs>
+        <w:ind w:left="3600" w:hanging="360"/>
+      </w:pPr>
+      <w:rPr>
+        <w:rFonts w:ascii="Wingdings" w:hAnsi="Wingdings" w:hint="default"/>
+        <w:sz w:val="20"/>
+      </w:rPr>
+    </w:lvl>
+    <w:lvl w:ilvl="5" w:tentative="1">
+      <w:start w:val="1"/>
+      <w:numFmt w:val="bullet"/>
+      <w:lvlText w:val=""/>
+      <w:lvlJc w:val="left"/>
+      <w:pPr>
+        <w:tabs>
+          <w:tab w:val="num" w:pos="4320"/>
+        </w:tabs>
+        <w:ind w:left="4320" w:hanging="360"/>
+      </w:pPr>
+      <w:rPr>
+        <w:rFonts w:ascii="Wingdings" w:hAnsi="Wingdings" w:hint="default"/>
+        <w:sz w:val="20"/>
+      </w:rPr>
+    </w:lvl>
+    <w:lvl w:ilvl="6" w:tentative="1">
+      <w:start w:val="1"/>
+      <w:numFmt w:val="bullet"/>
+      <w:lvlText w:val=""/>
+      <w:lvlJc w:val="left"/>
+      <w:pPr>
+        <w:tabs>
+          <w:tab w:val="num" w:pos="5040"/>
+        </w:tabs>
+        <w:ind w:left="5040" w:hanging="360"/>
+      </w:pPr>
+      <w:rPr>
+        <w:rFonts w:ascii="Wingdings" w:hAnsi="Wingdings" w:hint="default"/>
+        <w:sz w:val="20"/>
+      </w:rPr>
+    </w:lvl>
+    <w:lvl w:ilvl="7" w:tentative="1">
+      <w:start w:val="1"/>
+      <w:numFmt w:val="bullet"/>
+      <w:lvlText w:val=""/>
+      <w:lvlJc w:val="left"/>
+      <w:pPr>
+        <w:tabs>
+          <w:tab w:val="num" w:pos="5760"/>
+        </w:tabs>
+        <w:ind w:left="5760" w:hanging="360"/>
+      </w:pPr>
+      <w:rPr>
+        <w:rFonts w:ascii="Wingdings" w:hAnsi="Wingdings" w:hint="default"/>
+        <w:sz w:val="20"/>
+      </w:rPr>
+    </w:lvl>
+    <w:lvl w:ilvl="8" w:tentative="1">
+      <w:start w:val="1"/>
+      <w:numFmt w:val="bullet"/>
+      <w:lvlText w:val=""/>
+      <w:lvlJc w:val="left"/>
+      <w:pPr>
+        <w:tabs>
+          <w:tab w:val="num" w:pos="6480"/>
+        </w:tabs>
+        <w:ind w:left="6480" w:hanging="360"/>
+      </w:pPr>
+      <w:rPr>
+        <w:rFonts w:ascii="Wingdings" w:hAnsi="Wingdings" w:hint="default"/>
+        <w:sz w:val="20"/>
+      </w:rPr>
+    </w:lvl>
+  </w:abstractNum>
+  <w:abstractNum w:abstractNumId="6" w15:restartNumberingAfterBreak="0">
+    <w:nsid w:val="2C200EEE"/>
+    <w:multiLevelType w:val="multilevel"/>
+    <w:tmpl w:val="E2E06D82"/>
+    <w:lvl w:ilvl="0">
+      <w:start w:val="1"/>
+      <w:numFmt w:val="bullet"/>
+      <w:lvlText w:val=""/>
+      <w:lvlJc w:val="left"/>
+      <w:pPr>
+        <w:tabs>
+          <w:tab w:val="num" w:pos="720"/>
+        </w:tabs>
+        <w:ind w:left="720" w:hanging="360"/>
+      </w:pPr>
+      <w:rPr>
+        <w:rFonts w:ascii="Symbol" w:hAnsi="Symbol" w:hint="default"/>
+        <w:sz w:val="20"/>
+      </w:rPr>
+    </w:lvl>
+    <w:lvl w:ilvl="1">
+      <w:start w:val="1"/>
+      <w:numFmt w:val="bullet"/>
+      <w:lvlText w:val="o"/>
+      <w:lvlJc w:val="left"/>
+      <w:pPr>
+        <w:tabs>
+          <w:tab w:val="num" w:pos="1440"/>
+        </w:tabs>
+        <w:ind w:left="1440" w:hanging="360"/>
+      </w:pPr>
+      <w:rPr>
+        <w:rFonts w:ascii="Courier New" w:hAnsi="Courier New" w:hint="default"/>
+        <w:sz w:val="20"/>
+      </w:rPr>
+    </w:lvl>
+    <w:lvl w:ilvl="2" w:tentative="1">
+      <w:start w:val="1"/>
+      <w:numFmt w:val="bullet"/>
+      <w:lvlText w:val=""/>
+      <w:lvlJc w:val="left"/>
+      <w:pPr>
+        <w:tabs>
+          <w:tab w:val="num" w:pos="2160"/>
+        </w:tabs>
+        <w:ind w:left="2160" w:hanging="360"/>
+      </w:pPr>
+      <w:rPr>
+        <w:rFonts w:ascii="Wingdings" w:hAnsi="Wingdings" w:hint="default"/>
+        <w:sz w:val="20"/>
+      </w:rPr>
+    </w:lvl>
+    <w:lvl w:ilvl="3" w:tentative="1">
+      <w:start w:val="1"/>
+      <w:numFmt w:val="bullet"/>
+      <w:lvlText w:val=""/>
+      <w:lvlJc w:val="left"/>
+      <w:pPr>
+        <w:tabs>
+          <w:tab w:val="num" w:pos="2880"/>
+        </w:tabs>
+        <w:ind w:left="2880" w:hanging="360"/>
+      </w:pPr>
+      <w:rPr>
+        <w:rFonts w:ascii="Wingdings" w:hAnsi="Wingdings" w:hint="default"/>
+        <w:sz w:val="20"/>
+      </w:rPr>
+    </w:lvl>
+    <w:lvl w:ilvl="4" w:tentative="1">
+      <w:start w:val="1"/>
+      <w:numFmt w:val="bullet"/>
+      <w:lvlText w:val=""/>
+      <w:lvlJc w:val="left"/>
+      <w:pPr>
+        <w:tabs>
+          <w:tab w:val="num" w:pos="3600"/>
+        </w:tabs>
+        <w:ind w:left="3600" w:hanging="360"/>
+      </w:pPr>
+      <w:rPr>
+        <w:rFonts w:ascii="Wingdings" w:hAnsi="Wingdings" w:hint="default"/>
+        <w:sz w:val="20"/>
+      </w:rPr>
+    </w:lvl>
+    <w:lvl w:ilvl="5" w:tentative="1">
+      <w:start w:val="1"/>
+      <w:numFmt w:val="bullet"/>
+      <w:lvlText w:val=""/>
+      <w:lvlJc w:val="left"/>
+      <w:pPr>
+        <w:tabs>
+          <w:tab w:val="num" w:pos="4320"/>
+        </w:tabs>
+        <w:ind w:left="4320" w:hanging="360"/>
+      </w:pPr>
+      <w:rPr>
+        <w:rFonts w:ascii="Wingdings" w:hAnsi="Wingdings" w:hint="default"/>
+        <w:sz w:val="20"/>
+      </w:rPr>
+    </w:lvl>
+    <w:lvl w:ilvl="6" w:tentative="1">
+      <w:start w:val="1"/>
+      <w:numFmt w:val="bullet"/>
+      <w:lvlText w:val=""/>
+      <w:lvlJc w:val="left"/>
+      <w:pPr>
+        <w:tabs>
+          <w:tab w:val="num" w:pos="5040"/>
+        </w:tabs>
+        <w:ind w:left="5040" w:hanging="360"/>
+      </w:pPr>
+      <w:rPr>
+        <w:rFonts w:ascii="Wingdings" w:hAnsi="Wingdings" w:hint="default"/>
+        <w:sz w:val="20"/>
+      </w:rPr>
+    </w:lvl>
+    <w:lvl w:ilvl="7" w:tentative="1">
+      <w:start w:val="1"/>
+      <w:numFmt w:val="bullet"/>
+      <w:lvlText w:val=""/>
+      <w:lvlJc w:val="left"/>
+      <w:pPr>
+        <w:tabs>
+          <w:tab w:val="num" w:pos="5760"/>
+        </w:tabs>
+        <w:ind w:left="5760" w:hanging="360"/>
+      </w:pPr>
+      <w:rPr>
+        <w:rFonts w:ascii="Wingdings" w:hAnsi="Wingdings" w:hint="default"/>
+        <w:sz w:val="20"/>
+      </w:rPr>
+    </w:lvl>
+    <w:lvl w:ilvl="8" w:tentative="1">
+      <w:start w:val="1"/>
+      <w:numFmt w:val="bullet"/>
+      <w:lvlText w:val=""/>
+      <w:lvlJc w:val="left"/>
+      <w:pPr>
+        <w:tabs>
+          <w:tab w:val="num" w:pos="6480"/>
+        </w:tabs>
+        <w:ind w:left="6480" w:hanging="360"/>
+      </w:pPr>
+      <w:rPr>
+        <w:rFonts w:ascii="Wingdings" w:hAnsi="Wingdings" w:hint="default"/>
+        <w:sz w:val="20"/>
+      </w:rPr>
+    </w:lvl>
+  </w:abstractNum>
+  <w:abstractNum w:abstractNumId="7" w15:restartNumberingAfterBreak="0">
+    <w:nsid w:val="45D42475"/>
+    <w:multiLevelType w:val="multilevel"/>
+    <w:tmpl w:val="94867490"/>
+    <w:lvl w:ilvl="0">
+      <w:start w:val="1"/>
+      <w:numFmt w:val="bullet"/>
+      <w:lvlText w:val=""/>
+      <w:lvlJc w:val="left"/>
+      <w:pPr>
+        <w:tabs>
+          <w:tab w:val="num" w:pos="720"/>
+        </w:tabs>
+        <w:ind w:left="720" w:hanging="360"/>
+      </w:pPr>
+      <w:rPr>
+        <w:rFonts w:ascii="Symbol" w:hAnsi="Symbol" w:hint="default"/>
+        <w:sz w:val="20"/>
+      </w:rPr>
+    </w:lvl>
+    <w:lvl w:ilvl="1">
+      <w:start w:val="1"/>
+      <w:numFmt w:val="bullet"/>
+      <w:lvlText w:val="o"/>
+      <w:lvlJc w:val="left"/>
+      <w:pPr>
+        <w:tabs>
+          <w:tab w:val="num" w:pos="1440"/>
+        </w:tabs>
+        <w:ind w:left="1440" w:hanging="360"/>
+      </w:pPr>
+      <w:rPr>
+        <w:rFonts w:ascii="Courier New" w:hAnsi="Courier New" w:hint="default"/>
+        <w:sz w:val="20"/>
+      </w:rPr>
+    </w:lvl>
+    <w:lvl w:ilvl="2" w:tentative="1">
+      <w:start w:val="1"/>
+      <w:numFmt w:val="bullet"/>
+      <w:lvlText w:val=""/>
+      <w:lvlJc w:val="left"/>
+      <w:pPr>
+        <w:tabs>
+          <w:tab w:val="num" w:pos="2160"/>
+        </w:tabs>
+        <w:ind w:left="2160" w:hanging="360"/>
+      </w:pPr>
+      <w:rPr>
+        <w:rFonts w:ascii="Wingdings" w:hAnsi="Wingdings" w:hint="default"/>
+        <w:sz w:val="20"/>
+      </w:rPr>
+    </w:lvl>
+    <w:lvl w:ilvl="3" w:tentative="1">
+      <w:start w:val="1"/>
+      <w:numFmt w:val="bullet"/>
+      <w:lvlText w:val=""/>
+      <w:lvlJc w:val="left"/>
+      <w:pPr>
+        <w:tabs>
+          <w:tab w:val="num" w:pos="2880"/>
+        </w:tabs>
+        <w:ind w:left="2880" w:hanging="360"/>
+      </w:pPr>
+      <w:rPr>
+        <w:rFonts w:ascii="Wingdings" w:hAnsi="Wingdings" w:hint="default"/>
+        <w:sz w:val="20"/>
+      </w:rPr>
+    </w:lvl>
+    <w:lvl w:ilvl="4" w:tentative="1">
+      <w:start w:val="1"/>
+      <w:numFmt w:val="bullet"/>
+      <w:lvlText w:val=""/>
+      <w:lvlJc w:val="left"/>
+      <w:pPr>
+        <w:tabs>
+          <w:tab w:val="num" w:pos="3600"/>
+        </w:tabs>
+        <w:ind w:left="3600" w:hanging="360"/>
+      </w:pPr>
+      <w:rPr>
+        <w:rFonts w:ascii="Wingdings" w:hAnsi="Wingdings" w:hint="default"/>
+        <w:sz w:val="20"/>
+      </w:rPr>
+    </w:lvl>
+    <w:lvl w:ilvl="5" w:tentative="1">
+      <w:start w:val="1"/>
+      <w:numFmt w:val="bullet"/>
+      <w:lvlText w:val=""/>
+      <w:lvlJc w:val="left"/>
+      <w:pPr>
+        <w:tabs>
+          <w:tab w:val="num" w:pos="4320"/>
+        </w:tabs>
+        <w:ind w:left="4320" w:hanging="360"/>
+      </w:pPr>
+      <w:rPr>
+        <w:rFonts w:ascii="Wingdings" w:hAnsi="Wingdings" w:hint="default"/>
+        <w:sz w:val="20"/>
+      </w:rPr>
+    </w:lvl>
+    <w:lvl w:ilvl="6" w:tentative="1">
+      <w:start w:val="1"/>
+      <w:numFmt w:val="bullet"/>
+      <w:lvlText w:val=""/>
+      <w:lvlJc w:val="left"/>
+      <w:pPr>
+        <w:tabs>
+          <w:tab w:val="num" w:pos="5040"/>
+        </w:tabs>
+        <w:ind w:left="5040" w:hanging="360"/>
+      </w:pPr>
+      <w:rPr>
+        <w:rFonts w:ascii="Wingdings" w:hAnsi="Wingdings" w:hint="default"/>
+        <w:sz w:val="20"/>
+      </w:rPr>
+    </w:lvl>
+    <w:lvl w:ilvl="7" w:tentative="1">
+      <w:start w:val="1"/>
+      <w:numFmt w:val="bullet"/>
+      <w:lvlText w:val=""/>
+      <w:lvlJc w:val="left"/>
+      <w:pPr>
+        <w:tabs>
+          <w:tab w:val="num" w:pos="5760"/>
+        </w:tabs>
+        <w:ind w:left="5760" w:hanging="360"/>
+      </w:pPr>
+      <w:rPr>
+        <w:rFonts w:ascii="Wingdings" w:hAnsi="Wingdings" w:hint="default"/>
+        <w:sz w:val="20"/>
+      </w:rPr>
+    </w:lvl>
+    <w:lvl w:ilvl="8" w:tentative="1">
+      <w:start w:val="1"/>
+      <w:numFmt w:val="bullet"/>
+      <w:lvlText w:val=""/>
+      <w:lvlJc w:val="left"/>
+      <w:pPr>
+        <w:tabs>
+          <w:tab w:val="num" w:pos="6480"/>
+        </w:tabs>
+        <w:ind w:left="6480" w:hanging="360"/>
+      </w:pPr>
+      <w:rPr>
+        <w:rFonts w:ascii="Wingdings" w:hAnsi="Wingdings" w:hint="default"/>
+        <w:sz w:val="20"/>
+      </w:rPr>
+    </w:lvl>
+  </w:abstractNum>
+  <w:abstractNum w:abstractNumId="8" w15:restartNumberingAfterBreak="0">
+    <w:nsid w:val="4B8F7330"/>
+    <w:multiLevelType w:val="multilevel"/>
+    <w:tmpl w:val="86B07C14"/>
+    <w:lvl w:ilvl="0">
+      <w:start w:val="1"/>
+      <w:numFmt w:val="bullet"/>
+      <w:lvlText w:val=""/>
+      <w:lvlJc w:val="left"/>
+      <w:pPr>
+        <w:tabs>
+          <w:tab w:val="num" w:pos="720"/>
+        </w:tabs>
+        <w:ind w:left="720" w:hanging="360"/>
+      </w:pPr>
+      <w:rPr>
+        <w:rFonts w:ascii="Symbol" w:hAnsi="Symbol" w:hint="default"/>
+        <w:sz w:val="20"/>
+      </w:rPr>
+    </w:lvl>
+    <w:lvl w:ilvl="1" w:tentative="1">
+      <w:start w:val="1"/>
+      <w:numFmt w:val="bullet"/>
+      <w:lvlText w:val="o"/>
+      <w:lvlJc w:val="left"/>
+      <w:pPr>
+        <w:tabs>
+          <w:tab w:val="num" w:pos="1440"/>
+        </w:tabs>
+        <w:ind w:left="1440" w:hanging="360"/>
+      </w:pPr>
+      <w:rPr>
+        <w:rFonts w:ascii="Courier New" w:hAnsi="Courier New" w:hint="default"/>
+        <w:sz w:val="20"/>
+      </w:rPr>
+    </w:lvl>
+    <w:lvl w:ilvl="2" w:tentative="1">
+      <w:start w:val="1"/>
+      <w:numFmt w:val="bullet"/>
+      <w:lvlText w:val=""/>
+      <w:lvlJc w:val="left"/>
+      <w:pPr>
+        <w:tabs>
+          <w:tab w:val="num" w:pos="2160"/>
+        </w:tabs>
+        <w:ind w:left="2160" w:hanging="360"/>
+      </w:pPr>
+      <w:rPr>
+        <w:rFonts w:ascii="Wingdings" w:hAnsi="Wingdings" w:hint="default"/>
+        <w:sz w:val="20"/>
+      </w:rPr>
+    </w:lvl>
+    <w:lvl w:ilvl="3" w:tentative="1">
+      <w:start w:val="1"/>
+      <w:numFmt w:val="bullet"/>
+      <w:lvlText w:val=""/>
+      <w:lvlJc w:val="left"/>
+      <w:pPr>
+        <w:tabs>
+          <w:tab w:val="num" w:pos="2880"/>
+        </w:tabs>
+        <w:ind w:left="2880" w:hanging="360"/>
+      </w:pPr>
+      <w:rPr>
+        <w:rFonts w:ascii="Wingdings" w:hAnsi="Wingdings" w:hint="default"/>
+        <w:sz w:val="20"/>
+      </w:rPr>
+    </w:lvl>
+    <w:lvl w:ilvl="4" w:tentative="1">
+      <w:start w:val="1"/>
+      <w:numFmt w:val="bullet"/>
+      <w:lvlText w:val=""/>
+      <w:lvlJc w:val="left"/>
+      <w:pPr>
+        <w:tabs>
+          <w:tab w:val="num" w:pos="3600"/>
+        </w:tabs>
+        <w:ind w:left="3600" w:hanging="360"/>
+      </w:pPr>
+      <w:rPr>
+        <w:rFonts w:ascii="Wingdings" w:hAnsi="Wingdings" w:hint="default"/>
+        <w:sz w:val="20"/>
+      </w:rPr>
+    </w:lvl>
+    <w:lvl w:ilvl="5" w:tentative="1">
+      <w:start w:val="1"/>
+      <w:numFmt w:val="bullet"/>
+      <w:lvlText w:val=""/>
+      <w:lvlJc w:val="left"/>
+      <w:pPr>
+        <w:tabs>
+          <w:tab w:val="num" w:pos="4320"/>
+        </w:tabs>
+        <w:ind w:left="4320" w:hanging="360"/>
+      </w:pPr>
+      <w:rPr>
+        <w:rFonts w:ascii="Wingdings" w:hAnsi="Wingdings" w:hint="default"/>
+        <w:sz w:val="20"/>
+      </w:rPr>
+    </w:lvl>
+    <w:lvl w:ilvl="6" w:tentative="1">
+      <w:start w:val="1"/>
+      <w:numFmt w:val="bullet"/>
+      <w:lvlText w:val=""/>
+      <w:lvlJc w:val="left"/>
+      <w:pPr>
+        <w:tabs>
+          <w:tab w:val="num" w:pos="5040"/>
+        </w:tabs>
+        <w:ind w:left="5040" w:hanging="360"/>
+      </w:pPr>
+      <w:rPr>
+        <w:rFonts w:ascii="Wingdings" w:hAnsi="Wingdings" w:hint="default"/>
+        <w:sz w:val="20"/>
+      </w:rPr>
+    </w:lvl>
+    <w:lvl w:ilvl="7" w:tentative="1">
+      <w:start w:val="1"/>
+      <w:numFmt w:val="bullet"/>
+      <w:lvlText w:val=""/>
+      <w:lvlJc w:val="left"/>
+      <w:pPr>
+        <w:tabs>
+          <w:tab w:val="num" w:pos="5760"/>
+        </w:tabs>
+        <w:ind w:left="5760" w:hanging="360"/>
+      </w:pPr>
+      <w:rPr>
+        <w:rFonts w:ascii="Wingdings" w:hAnsi="Wingdings" w:hint="default"/>
+        <w:sz w:val="20"/>
+      </w:rPr>
+    </w:lvl>
+    <w:lvl w:ilvl="8" w:tentative="1">
+      <w:start w:val="1"/>
+      <w:numFmt w:val="bullet"/>
+      <w:lvlText w:val=""/>
+      <w:lvlJc w:val="left"/>
+      <w:pPr>
+        <w:tabs>
+          <w:tab w:val="num" w:pos="6480"/>
+        </w:tabs>
+        <w:ind w:left="6480" w:hanging="360"/>
+      </w:pPr>
+      <w:rPr>
+        <w:rFonts w:ascii="Wingdings" w:hAnsi="Wingdings" w:hint="default"/>
+        <w:sz w:val="20"/>
+      </w:rPr>
+    </w:lvl>
+  </w:abstractNum>
+  <w:abstractNum w:abstractNumId="9" w15:restartNumberingAfterBreak="0">
+    <w:nsid w:val="4E8E5320"/>
+    <w:multiLevelType w:val="multilevel"/>
+    <w:tmpl w:val="8C40FDA4"/>
+    <w:lvl w:ilvl="0">
+      <w:start w:val="1"/>
+      <w:numFmt w:val="bullet"/>
+      <w:lvlText w:val=""/>
+      <w:lvlJc w:val="left"/>
+      <w:pPr>
+        <w:tabs>
+          <w:tab w:val="num" w:pos="720"/>
+        </w:tabs>
+        <w:ind w:left="720" w:hanging="360"/>
+      </w:pPr>
+      <w:rPr>
+        <w:rFonts w:ascii="Symbol" w:hAnsi="Symbol" w:hint="default"/>
+        <w:sz w:val="20"/>
+      </w:rPr>
+    </w:lvl>
+    <w:lvl w:ilvl="1" w:tentative="1">
+      <w:start w:val="1"/>
+      <w:numFmt w:val="bullet"/>
+      <w:lvlText w:val="o"/>
+      <w:lvlJc w:val="left"/>
+      <w:pPr>
+        <w:tabs>
+          <w:tab w:val="num" w:pos="1440"/>
+        </w:tabs>
+        <w:ind w:left="1440" w:hanging="360"/>
+      </w:pPr>
+      <w:rPr>
+        <w:rFonts w:ascii="Courier New" w:hAnsi="Courier New" w:hint="default"/>
+        <w:sz w:val="20"/>
+      </w:rPr>
+    </w:lvl>
+    <w:lvl w:ilvl="2" w:tentative="1">
+      <w:start w:val="1"/>
+      <w:numFmt w:val="bullet"/>
+      <w:lvlText w:val=""/>
+      <w:lvlJc w:val="left"/>
+      <w:pPr>
+        <w:tabs>
+          <w:tab w:val="num" w:pos="2160"/>
+        </w:tabs>
+        <w:ind w:left="2160" w:hanging="360"/>
+      </w:pPr>
+      <w:rPr>
+        <w:rFonts w:ascii="Wingdings" w:hAnsi="Wingdings" w:hint="default"/>
+        <w:sz w:val="20"/>
+      </w:rPr>
+    </w:lvl>
+    <w:lvl w:ilvl="3" w:tentative="1">
+      <w:start w:val="1"/>
+      <w:numFmt w:val="bullet"/>
+      <w:lvlText w:val=""/>
+      <w:lvlJc w:val="left"/>
+      <w:pPr>
+        <w:tabs>
+          <w:tab w:val="num" w:pos="2880"/>
+        </w:tabs>
+        <w:ind w:left="2880" w:hanging="360"/>
+      </w:pPr>
+      <w:rPr>
+        <w:rFonts w:ascii="Wingdings" w:hAnsi="Wingdings" w:hint="default"/>
+        <w:sz w:val="20"/>
+      </w:rPr>
+    </w:lvl>
+    <w:lvl w:ilvl="4" w:tentative="1">
+      <w:start w:val="1"/>
+      <w:numFmt w:val="bullet"/>
+      <w:lvlText w:val=""/>
+      <w:lvlJc w:val="left"/>
+      <w:pPr>
+        <w:tabs>
+          <w:tab w:val="num" w:pos="3600"/>
+        </w:tabs>
+        <w:ind w:left="3600" w:hanging="360"/>
+      </w:pPr>
+      <w:rPr>
+        <w:rFonts w:ascii="Wingdings" w:hAnsi="Wingdings" w:hint="default"/>
+        <w:sz w:val="20"/>
+      </w:rPr>
+    </w:lvl>
+    <w:lvl w:ilvl="5" w:tentative="1">
+      <w:start w:val="1"/>
+      <w:numFmt w:val="bullet"/>
+      <w:lvlText w:val=""/>
+      <w:lvlJc w:val="left"/>
+      <w:pPr>
+        <w:tabs>
+          <w:tab w:val="num" w:pos="4320"/>
+        </w:tabs>
+        <w:ind w:left="4320" w:hanging="360"/>
+      </w:pPr>
+      <w:rPr>
+        <w:rFonts w:ascii="Wingdings" w:hAnsi="Wingdings" w:hint="default"/>
+        <w:sz w:val="20"/>
+      </w:rPr>
+    </w:lvl>
+    <w:lvl w:ilvl="6" w:tentative="1">
+      <w:start w:val="1"/>
+      <w:numFmt w:val="bullet"/>
+      <w:lvlText w:val=""/>
+      <w:lvlJc w:val="left"/>
+      <w:pPr>
+        <w:tabs>
+          <w:tab w:val="num" w:pos="5040"/>
+        </w:tabs>
+        <w:ind w:left="5040" w:hanging="360"/>
+      </w:pPr>
+      <w:rPr>
+        <w:rFonts w:ascii="Wingdings" w:hAnsi="Wingdings" w:hint="default"/>
+        <w:sz w:val="20"/>
+      </w:rPr>
+    </w:lvl>
+    <w:lvl w:ilvl="7" w:tentative="1">
+      <w:start w:val="1"/>
+      <w:numFmt w:val="bullet"/>
+      <w:lvlText w:val=""/>
+      <w:lvlJc w:val="left"/>
+      <w:pPr>
+        <w:tabs>
+          <w:tab w:val="num" w:pos="5760"/>
+        </w:tabs>
+        <w:ind w:left="5760" w:hanging="360"/>
+      </w:pPr>
+      <w:rPr>
+        <w:rFonts w:ascii="Wingdings" w:hAnsi="Wingdings" w:hint="default"/>
+        <w:sz w:val="20"/>
+      </w:rPr>
+    </w:lvl>
+    <w:lvl w:ilvl="8" w:tentative="1">
+      <w:start w:val="1"/>
+      <w:numFmt w:val="bullet"/>
+      <w:lvlText w:val=""/>
+      <w:lvlJc w:val="left"/>
+      <w:pPr>
+        <w:tabs>
+          <w:tab w:val="num" w:pos="6480"/>
+        </w:tabs>
+        <w:ind w:left="6480" w:hanging="360"/>
+      </w:pPr>
+      <w:rPr>
+        <w:rFonts w:ascii="Wingdings" w:hAnsi="Wingdings" w:hint="default"/>
+        <w:sz w:val="20"/>
+      </w:rPr>
+    </w:lvl>
+  </w:abstractNum>
+  <w:abstractNum w:abstractNumId="10" w15:restartNumberingAfterBreak="0">
+    <w:nsid w:val="4ED3475E"/>
+    <w:multiLevelType w:val="multilevel"/>
+    <w:tmpl w:val="457CF4BA"/>
+    <w:lvl w:ilvl="0">
+      <w:start w:val="1"/>
+      <w:numFmt w:val="bullet"/>
+      <w:lvlText w:val=""/>
+      <w:lvlJc w:val="left"/>
+      <w:pPr>
+        <w:tabs>
+          <w:tab w:val="num" w:pos="720"/>
+        </w:tabs>
+        <w:ind w:left="720" w:hanging="360"/>
+      </w:pPr>
+      <w:rPr>
+        <w:rFonts w:ascii="Symbol" w:hAnsi="Symbol" w:hint="default"/>
+        <w:sz w:val="20"/>
+      </w:rPr>
+    </w:lvl>
+    <w:lvl w:ilvl="1" w:tentative="1">
+      <w:start w:val="1"/>
+      <w:numFmt w:val="bullet"/>
+      <w:lvlText w:val="o"/>
+      <w:lvlJc w:val="left"/>
+      <w:pPr>
+        <w:tabs>
+          <w:tab w:val="num" w:pos="1440"/>
+        </w:tabs>
+        <w:ind w:left="1440" w:hanging="360"/>
+      </w:pPr>
+      <w:rPr>
+        <w:rFonts w:ascii="Courier New" w:hAnsi="Courier New" w:hint="default"/>
+        <w:sz w:val="20"/>
+      </w:rPr>
+    </w:lvl>
+    <w:lvl w:ilvl="2" w:tentative="1">
+      <w:start w:val="1"/>
+      <w:numFmt w:val="bullet"/>
+      <w:lvlText w:val=""/>
+      <w:lvlJc w:val="left"/>
+      <w:pPr>
+        <w:tabs>
+          <w:tab w:val="num" w:pos="2160"/>
+        </w:tabs>
+        <w:ind w:left="2160" w:hanging="360"/>
+      </w:pPr>
+      <w:rPr>
+        <w:rFonts w:ascii="Wingdings" w:hAnsi="Wingdings" w:hint="default"/>
+        <w:sz w:val="20"/>
+      </w:rPr>
+    </w:lvl>
+    <w:lvl w:ilvl="3" w:tentative="1">
+      <w:start w:val="1"/>
+      <w:numFmt w:val="bullet"/>
+      <w:lvlText w:val=""/>
+      <w:lvlJc w:val="left"/>
+      <w:pPr>
+        <w:tabs>
+          <w:tab w:val="num" w:pos="2880"/>
+        </w:tabs>
+        <w:ind w:left="2880" w:hanging="360"/>
+      </w:pPr>
+      <w:rPr>
+        <w:rFonts w:ascii="Wingdings" w:hAnsi="Wingdings" w:hint="default"/>
+        <w:sz w:val="20"/>
+      </w:rPr>
+    </w:lvl>
+    <w:lvl w:ilvl="4" w:tentative="1">
+      <w:start w:val="1"/>
+      <w:numFmt w:val="bullet"/>
+      <w:lvlText w:val=""/>
+      <w:lvlJc w:val="left"/>
+      <w:pPr>
+        <w:tabs>
+          <w:tab w:val="num" w:pos="3600"/>
+        </w:tabs>
+        <w:ind w:left="3600" w:hanging="360"/>
+      </w:pPr>
+      <w:rPr>
+        <w:rFonts w:ascii="Wingdings" w:hAnsi="Wingdings" w:hint="default"/>
+        <w:sz w:val="20"/>
+      </w:rPr>
+    </w:lvl>
+    <w:lvl w:ilvl="5" w:tentative="1">
+      <w:start w:val="1"/>
+      <w:numFmt w:val="bullet"/>
+      <w:lvlText w:val=""/>
+      <w:lvlJc w:val="left"/>
+      <w:pPr>
+        <w:tabs>
+          <w:tab w:val="num" w:pos="4320"/>
+        </w:tabs>
+        <w:ind w:left="4320" w:hanging="360"/>
+      </w:pPr>
+      <w:rPr>
+        <w:rFonts w:ascii="Wingdings" w:hAnsi="Wingdings" w:hint="default"/>
+        <w:sz w:val="20"/>
+      </w:rPr>
+    </w:lvl>
+    <w:lvl w:ilvl="6" w:tentative="1">
+      <w:start w:val="1"/>
+      <w:numFmt w:val="bullet"/>
+      <w:lvlText w:val=""/>
+      <w:lvlJc w:val="left"/>
+      <w:pPr>
+        <w:tabs>
+          <w:tab w:val="num" w:pos="5040"/>
+        </w:tabs>
+        <w:ind w:left="5040" w:hanging="360"/>
+      </w:pPr>
+      <w:rPr>
+        <w:rFonts w:ascii="Wingdings" w:hAnsi="Wingdings" w:hint="default"/>
+        <w:sz w:val="20"/>
+      </w:rPr>
+    </w:lvl>
+    <w:lvl w:ilvl="7" w:tentative="1">
+      <w:start w:val="1"/>
+      <w:numFmt w:val="bullet"/>
+      <w:lvlText w:val=""/>
+      <w:lvlJc w:val="left"/>
+      <w:pPr>
+        <w:tabs>
+          <w:tab w:val="num" w:pos="5760"/>
+        </w:tabs>
+        <w:ind w:left="5760" w:hanging="360"/>
+      </w:pPr>
+      <w:rPr>
+        <w:rFonts w:ascii="Wingdings" w:hAnsi="Wingdings" w:hint="default"/>
+        <w:sz w:val="20"/>
+      </w:rPr>
+    </w:lvl>
+    <w:lvl w:ilvl="8" w:tentative="1">
+      <w:start w:val="1"/>
+      <w:numFmt w:val="bullet"/>
+      <w:lvlText w:val=""/>
+      <w:lvlJc w:val="left"/>
+      <w:pPr>
+        <w:tabs>
+          <w:tab w:val="num" w:pos="6480"/>
+        </w:tabs>
+        <w:ind w:left="6480" w:hanging="360"/>
+      </w:pPr>
+      <w:rPr>
+        <w:rFonts w:ascii="Wingdings" w:hAnsi="Wingdings" w:hint="default"/>
+        <w:sz w:val="20"/>
+      </w:rPr>
+    </w:lvl>
+  </w:abstractNum>
+  <w:abstractNum w:abstractNumId="11" w15:restartNumberingAfterBreak="0">
+    <w:nsid w:val="664C4BE2"/>
+    <w:multiLevelType w:val="hybridMultilevel"/>
+    <w:tmpl w:val="26CA9C52"/>
+    <w:lvl w:ilvl="0" w:tplc="0809000F">
+      <w:start w:val="1"/>
+      <w:numFmt w:val="decimal"/>
+      <w:lvlText w:val="%1."/>
+      <w:lvlJc w:val="left"/>
+      <w:pPr>
+        <w:ind w:left="720" w:hanging="360"/>
+      </w:pPr>
+      <w:rPr>
+        <w:rFonts w:hint="default"/>
+      </w:rPr>
+    </w:lvl>
+    <w:lvl w:ilvl="1" w:tplc="08090019" w:tentative="1">
+      <w:start w:val="1"/>
+      <w:numFmt w:val="lowerLetter"/>
+      <w:lvlText w:val="%2."/>
+      <w:lvlJc w:val="left"/>
+      <w:pPr>
+        <w:ind w:left="1440" w:hanging="360"/>
+      </w:pPr>
+    </w:lvl>
+    <w:lvl w:ilvl="2" w:tplc="0809001B" w:tentative="1">
+      <w:start w:val="1"/>
+      <w:numFmt w:val="lowerRoman"/>
+      <w:lvlText w:val="%3."/>
+      <w:lvlJc w:val="right"/>
+      <w:pPr>
+        <w:ind w:left="2160" w:hanging="180"/>
+      </w:pPr>
+    </w:lvl>
+    <w:lvl w:ilvl="3" w:tplc="0809000F" w:tentative="1">
+      <w:start w:val="1"/>
+      <w:numFmt w:val="decimal"/>
+      <w:lvlText w:val="%4."/>
+      <w:lvlJc w:val="left"/>
+      <w:pPr>
+        <w:ind w:left="2880" w:hanging="360"/>
+      </w:pPr>
+    </w:lvl>
+    <w:lvl w:ilvl="4" w:tplc="08090019" w:tentative="1">
+      <w:start w:val="1"/>
+      <w:numFmt w:val="lowerLetter"/>
+      <w:lvlText w:val="%5."/>
+      <w:lvlJc w:val="left"/>
+      <w:pPr>
+        <w:ind w:left="3600" w:hanging="360"/>
+      </w:pPr>
+    </w:lvl>
+    <w:lvl w:ilvl="5" w:tplc="0809001B" w:tentative="1">
+      <w:start w:val="1"/>
+      <w:numFmt w:val="lowerRoman"/>
+      <w:lvlText w:val="%6."/>
+      <w:lvlJc w:val="right"/>
+      <w:pPr>
+        <w:ind w:left="4320" w:hanging="180"/>
+      </w:pPr>
+    </w:lvl>
+    <w:lvl w:ilvl="6" w:tplc="0809000F" w:tentative="1">
+      <w:start w:val="1"/>
+      <w:numFmt w:val="decimal"/>
+      <w:lvlText w:val="%7."/>
+      <w:lvlJc w:val="left"/>
+      <w:pPr>
+        <w:ind w:left="5040" w:hanging="360"/>
+      </w:pPr>
+    </w:lvl>
+    <w:lvl w:ilvl="7" w:tplc="08090019" w:tentative="1">
+      <w:start w:val="1"/>
+      <w:numFmt w:val="lowerLetter"/>
+      <w:lvlText w:val="%8."/>
+      <w:lvlJc w:val="left"/>
+      <w:pPr>
+        <w:ind w:left="5760" w:hanging="360"/>
+      </w:pPr>
+    </w:lvl>
+    <w:lvl w:ilvl="8" w:tplc="0809001B" w:tentative="1">
+      <w:start w:val="1"/>
+      <w:numFmt w:val="lowerRoman"/>
+      <w:lvlText w:val="%9."/>
+      <w:lvlJc w:val="right"/>
+      <w:pPr>
+        <w:ind w:left="6480" w:hanging="180"/>
+      </w:pPr>
+    </w:lvl>
+  </w:abstractNum>
+  <w:abstractNum w:abstractNumId="12" w15:restartNumberingAfterBreak="0">
+    <w:nsid w:val="68427343"/>
+    <w:multiLevelType w:val="multilevel"/>
+    <w:tmpl w:val="61965642"/>
+    <w:lvl w:ilvl="0">
+      <w:start w:val="1"/>
+      <w:numFmt w:val="bullet"/>
+      <w:lvlText w:val=""/>
+      <w:lvlJc w:val="left"/>
+      <w:pPr>
+        <w:tabs>
+          <w:tab w:val="num" w:pos="720"/>
+        </w:tabs>
+        <w:ind w:left="720" w:hanging="360"/>
+      </w:pPr>
+      <w:rPr>
+        <w:rFonts w:ascii="Symbol" w:hAnsi="Symbol" w:hint="default"/>
+        <w:sz w:val="20"/>
+      </w:rPr>
+    </w:lvl>
+    <w:lvl w:ilvl="1" w:tentative="1">
+      <w:start w:val="1"/>
+      <w:numFmt w:val="bullet"/>
+      <w:lvlText w:val="o"/>
+      <w:lvlJc w:val="left"/>
+      <w:pPr>
+        <w:tabs>
+          <w:tab w:val="num" w:pos="1440"/>
+        </w:tabs>
+        <w:ind w:left="1440" w:hanging="360"/>
+      </w:pPr>
+      <w:rPr>
+        <w:rFonts w:ascii="Courier New" w:hAnsi="Courier New" w:hint="default"/>
+        <w:sz w:val="20"/>
+      </w:rPr>
+    </w:lvl>
+    <w:lvl w:ilvl="2" w:tentative="1">
+      <w:start w:val="1"/>
+      <w:numFmt w:val="bullet"/>
+      <w:lvlText w:val=""/>
+      <w:lvlJc w:val="left"/>
+      <w:pPr>
+        <w:tabs>
+          <w:tab w:val="num" w:pos="2160"/>
+        </w:tabs>
+        <w:ind w:left="2160" w:hanging="360"/>
+      </w:pPr>
+      <w:rPr>
+        <w:rFonts w:ascii="Wingdings" w:hAnsi="Wingdings" w:hint="default"/>
+        <w:sz w:val="20"/>
+      </w:rPr>
+    </w:lvl>
+    <w:lvl w:ilvl="3" w:tentative="1">
+      <w:start w:val="1"/>
+      <w:numFmt w:val="bullet"/>
+      <w:lvlText w:val=""/>
+      <w:lvlJc w:val="left"/>
+      <w:pPr>
+        <w:tabs>
+          <w:tab w:val="num" w:pos="2880"/>
+        </w:tabs>
+        <w:ind w:left="2880" w:hanging="360"/>
+      </w:pPr>
+      <w:rPr>
+        <w:rFonts w:ascii="Wingdings" w:hAnsi="Wingdings" w:hint="default"/>
+        <w:sz w:val="20"/>
+      </w:rPr>
+    </w:lvl>
+    <w:lvl w:ilvl="4" w:tentative="1">
+      <w:start w:val="1"/>
+      <w:numFmt w:val="bullet"/>
+      <w:lvlText w:val=""/>
+      <w:lvlJc w:val="left"/>
+      <w:pPr>
+        <w:tabs>
+          <w:tab w:val="num" w:pos="3600"/>
+        </w:tabs>
+        <w:ind w:left="3600" w:hanging="360"/>
+      </w:pPr>
+      <w:rPr>
+        <w:rFonts w:ascii="Wingdings" w:hAnsi="Wingdings" w:hint="default"/>
+        <w:sz w:val="20"/>
+      </w:rPr>
+    </w:lvl>
+    <w:lvl w:ilvl="5" w:tentative="1">
+      <w:start w:val="1"/>
+      <w:numFmt w:val="bullet"/>
+      <w:lvlText w:val=""/>
+      <w:lvlJc w:val="left"/>
+      <w:pPr>
+        <w:tabs>
+          <w:tab w:val="num" w:pos="4320"/>
+        </w:tabs>
+        <w:ind w:left="4320" w:hanging="360"/>
+      </w:pPr>
+      <w:rPr>
+        <w:rFonts w:ascii="Wingdings" w:hAnsi="Wingdings" w:hint="default"/>
+        <w:sz w:val="20"/>
+      </w:rPr>
+    </w:lvl>
+    <w:lvl w:ilvl="6" w:tentative="1">
+      <w:start w:val="1"/>
+      <w:numFmt w:val="bullet"/>
+      <w:lvlText w:val=""/>
+      <w:lvlJc w:val="left"/>
+      <w:pPr>
+        <w:tabs>
+          <w:tab w:val="num" w:pos="5040"/>
+        </w:tabs>
+        <w:ind w:left="5040" w:hanging="360"/>
+      </w:pPr>
+      <w:rPr>
+        <w:rFonts w:ascii="Wingdings" w:hAnsi="Wingdings" w:hint="default"/>
+        <w:sz w:val="20"/>
+      </w:rPr>
+    </w:lvl>
+    <w:lvl w:ilvl="7" w:tentative="1">
+      <w:start w:val="1"/>
+      <w:numFmt w:val="bullet"/>
+      <w:lvlText w:val=""/>
+      <w:lvlJc w:val="left"/>
+      <w:pPr>
+        <w:tabs>
+          <w:tab w:val="num" w:pos="5760"/>
+        </w:tabs>
+        <w:ind w:left="5760" w:hanging="360"/>
+      </w:pPr>
+      <w:rPr>
+        <w:rFonts w:ascii="Wingdings" w:hAnsi="Wingdings" w:hint="default"/>
+        <w:sz w:val="20"/>
+      </w:rPr>
+    </w:lvl>
+    <w:lvl w:ilvl="8" w:tentative="1">
+      <w:start w:val="1"/>
+      <w:numFmt w:val="bullet"/>
+      <w:lvlText w:val=""/>
+      <w:lvlJc w:val="left"/>
+      <w:pPr>
+        <w:tabs>
+          <w:tab w:val="num" w:pos="6480"/>
+        </w:tabs>
+        <w:ind w:left="6480" w:hanging="360"/>
+      </w:pPr>
+      <w:rPr>
+        <w:rFonts w:ascii="Wingdings" w:hAnsi="Wingdings" w:hint="default"/>
+        <w:sz w:val="20"/>
+      </w:rPr>
+    </w:lvl>
+  </w:abstractNum>
+  <w:abstractNum w:abstractNumId="13" w15:restartNumberingAfterBreak="0">
+    <w:nsid w:val="69B45CEF"/>
+    <w:multiLevelType w:val="multilevel"/>
+    <w:tmpl w:val="2FD69B20"/>
+    <w:lvl w:ilvl="0">
+      <w:start w:val="1"/>
+      <w:numFmt w:val="bullet"/>
+      <w:lvlText w:val=""/>
+      <w:lvlJc w:val="left"/>
+      <w:pPr>
+        <w:tabs>
+          <w:tab w:val="num" w:pos="720"/>
+        </w:tabs>
+        <w:ind w:left="720" w:hanging="360"/>
+      </w:pPr>
+      <w:rPr>
+        <w:rFonts w:ascii="Symbol" w:hAnsi="Symbol" w:hint="default"/>
+        <w:sz w:val="20"/>
+      </w:rPr>
+    </w:lvl>
+    <w:lvl w:ilvl="1" w:tentative="1">
+      <w:start w:val="1"/>
+      <w:numFmt w:val="bullet"/>
+      <w:lvlText w:val="o"/>
+      <w:lvlJc w:val="left"/>
+      <w:pPr>
+        <w:tabs>
+          <w:tab w:val="num" w:pos="1440"/>
+        </w:tabs>
+        <w:ind w:left="1440" w:hanging="360"/>
+      </w:pPr>
+      <w:rPr>
+        <w:rFonts w:ascii="Courier New" w:hAnsi="Courier New" w:hint="default"/>
+        <w:sz w:val="20"/>
+      </w:rPr>
+    </w:lvl>
+    <w:lvl w:ilvl="2" w:tentative="1">
+      <w:start w:val="1"/>
+      <w:numFmt w:val="bullet"/>
+      <w:lvlText w:val=""/>
+      <w:lvlJc w:val="left"/>
+      <w:pPr>
+        <w:tabs>
+          <w:tab w:val="num" w:pos="2160"/>
+        </w:tabs>
+        <w:ind w:left="2160" w:hanging="360"/>
+      </w:pPr>
+      <w:rPr>
+        <w:rFonts w:ascii="Wingdings" w:hAnsi="Wingdings" w:hint="default"/>
+        <w:sz w:val="20"/>
+      </w:rPr>
+    </w:lvl>
+    <w:lvl w:ilvl="3" w:tentative="1">
+      <w:start w:val="1"/>
+      <w:numFmt w:val="bullet"/>
+      <w:lvlText w:val=""/>
+      <w:lvlJc w:val="left"/>
+      <w:pPr>
+        <w:tabs>
+          <w:tab w:val="num" w:pos="2880"/>
+        </w:tabs>
+        <w:ind w:left="2880" w:hanging="360"/>
+      </w:pPr>
+      <w:rPr>
+        <w:rFonts w:ascii="Wingdings" w:hAnsi="Wingdings" w:hint="default"/>
+        <w:sz w:val="20"/>
+      </w:rPr>
+    </w:lvl>
+    <w:lvl w:ilvl="4" w:tentative="1">
+      <w:start w:val="1"/>
+      <w:numFmt w:val="bullet"/>
+      <w:lvlText w:val=""/>
+      <w:lvlJc w:val="left"/>
+      <w:pPr>
+        <w:tabs>
+          <w:tab w:val="num" w:pos="3600"/>
+        </w:tabs>
+        <w:ind w:left="3600" w:hanging="360"/>
+      </w:pPr>
+      <w:rPr>
+        <w:rFonts w:ascii="Wingdings" w:hAnsi="Wingdings" w:hint="default"/>
+        <w:sz w:val="20"/>
+      </w:rPr>
+    </w:lvl>
+    <w:lvl w:ilvl="5" w:tentative="1">
+      <w:start w:val="1"/>
+      <w:numFmt w:val="bullet"/>
+      <w:lvlText w:val=""/>
+      <w:lvlJc w:val="left"/>
+      <w:pPr>
+        <w:tabs>
+          <w:tab w:val="num" w:pos="4320"/>
+        </w:tabs>
+        <w:ind w:left="4320" w:hanging="360"/>
+      </w:pPr>
+      <w:rPr>
+        <w:rFonts w:ascii="Wingdings" w:hAnsi="Wingdings" w:hint="default"/>
+        <w:sz w:val="20"/>
+      </w:rPr>
+    </w:lvl>
+    <w:lvl w:ilvl="6" w:tentative="1">
+      <w:start w:val="1"/>
+      <w:numFmt w:val="bullet"/>
+      <w:lvlText w:val=""/>
+      <w:lvlJc w:val="left"/>
+      <w:pPr>
+        <w:tabs>
+          <w:tab w:val="num" w:pos="5040"/>
+        </w:tabs>
+        <w:ind w:left="5040" w:hanging="360"/>
+      </w:pPr>
+      <w:rPr>
+        <w:rFonts w:ascii="Wingdings" w:hAnsi="Wingdings" w:hint="default"/>
+        <w:sz w:val="20"/>
+      </w:rPr>
+    </w:lvl>
+    <w:lvl w:ilvl="7" w:tentative="1">
+      <w:start w:val="1"/>
+      <w:numFmt w:val="bullet"/>
+      <w:lvlText w:val=""/>
+      <w:lvlJc w:val="left"/>
+      <w:pPr>
+        <w:tabs>
+          <w:tab w:val="num" w:pos="5760"/>
+        </w:tabs>
+        <w:ind w:left="5760" w:hanging="360"/>
+      </w:pPr>
+      <w:rPr>
+        <w:rFonts w:ascii="Wingdings" w:hAnsi="Wingdings" w:hint="default"/>
+        <w:sz w:val="20"/>
+      </w:rPr>
+    </w:lvl>
+    <w:lvl w:ilvl="8" w:tentative="1">
+      <w:start w:val="1"/>
+      <w:numFmt w:val="bullet"/>
+      <w:lvlText w:val=""/>
+      <w:lvlJc w:val="left"/>
+      <w:pPr>
+        <w:tabs>
+          <w:tab w:val="num" w:pos="6480"/>
+        </w:tabs>
+        <w:ind w:left="6480" w:hanging="360"/>
+      </w:pPr>
+      <w:rPr>
+        <w:rFonts w:ascii="Wingdings" w:hAnsi="Wingdings" w:hint="default"/>
+        <w:sz w:val="20"/>
+      </w:rPr>
+    </w:lvl>
+  </w:abstractNum>
+  <w:abstractNum w:abstractNumId="14" w15:restartNumberingAfterBreak="0">
+    <w:nsid w:val="6B7832EC"/>
+    <w:multiLevelType w:val="multilevel"/>
+    <w:tmpl w:val="A81A89CA"/>
+    <w:lvl w:ilvl="0">
+      <w:start w:val="1"/>
+      <w:numFmt w:val="bullet"/>
+      <w:lvlText w:val=""/>
+      <w:lvlJc w:val="left"/>
+      <w:pPr>
+        <w:tabs>
+          <w:tab w:val="num" w:pos="720"/>
+        </w:tabs>
+        <w:ind w:left="720" w:hanging="360"/>
+      </w:pPr>
+      <w:rPr>
+        <w:rFonts w:ascii="Symbol" w:hAnsi="Symbol" w:hint="default"/>
+        <w:sz w:val="20"/>
+      </w:rPr>
+    </w:lvl>
+    <w:lvl w:ilvl="1" w:tentative="1">
+      <w:start w:val="1"/>
+      <w:numFmt w:val="bullet"/>
+      <w:lvlText w:val="o"/>
+      <w:lvlJc w:val="left"/>
+      <w:pPr>
+        <w:tabs>
+          <w:tab w:val="num" w:pos="1440"/>
+        </w:tabs>
+        <w:ind w:left="1440" w:hanging="360"/>
+      </w:pPr>
+      <w:rPr>
+        <w:rFonts w:ascii="Courier New" w:hAnsi="Courier New" w:hint="default"/>
+        <w:sz w:val="20"/>
+      </w:rPr>
+    </w:lvl>
+    <w:lvl w:ilvl="2" w:tentative="1">
+      <w:start w:val="1"/>
+      <w:numFmt w:val="bullet"/>
+      <w:lvlText w:val=""/>
+      <w:lvlJc w:val="left"/>
+      <w:pPr>
+        <w:tabs>
+          <w:tab w:val="num" w:pos="2160"/>
+        </w:tabs>
+        <w:ind w:left="2160" w:hanging="360"/>
+      </w:pPr>
+      <w:rPr>
+        <w:rFonts w:ascii="Wingdings" w:hAnsi="Wingdings" w:hint="default"/>
+        <w:sz w:val="20"/>
+      </w:rPr>
+    </w:lvl>
+    <w:lvl w:ilvl="3" w:tentative="1">
+      <w:start w:val="1"/>
+      <w:numFmt w:val="bullet"/>
+      <w:lvlText w:val=""/>
+      <w:lvlJc w:val="left"/>
+      <w:pPr>
+        <w:tabs>
+          <w:tab w:val="num" w:pos="2880"/>
+        </w:tabs>
+        <w:ind w:left="2880" w:hanging="360"/>
+      </w:pPr>
+      <w:rPr>
+        <w:rFonts w:ascii="Wingdings" w:hAnsi="Wingdings" w:hint="default"/>
+        <w:sz w:val="20"/>
+      </w:rPr>
+    </w:lvl>
+    <w:lvl w:ilvl="4" w:tentative="1">
+      <w:start w:val="1"/>
+      <w:numFmt w:val="bullet"/>
+      <w:lvlText w:val=""/>
+      <w:lvlJc w:val="left"/>
+      <w:pPr>
+        <w:tabs>
+          <w:tab w:val="num" w:pos="3600"/>
+        </w:tabs>
+        <w:ind w:left="3600" w:hanging="360"/>
+      </w:pPr>
+      <w:rPr>
+        <w:rFonts w:ascii="Wingdings" w:hAnsi="Wingdings" w:hint="default"/>
+        <w:sz w:val="20"/>
+      </w:rPr>
+    </w:lvl>
+    <w:lvl w:ilvl="5" w:tentative="1">
+      <w:start w:val="1"/>
+      <w:numFmt w:val="bullet"/>
+      <w:lvlText w:val=""/>
+      <w:lvlJc w:val="left"/>
+      <w:pPr>
+        <w:tabs>
+          <w:tab w:val="num" w:pos="4320"/>
+        </w:tabs>
+        <w:ind w:left="4320" w:hanging="360"/>
+      </w:pPr>
+      <w:rPr>
+        <w:rFonts w:ascii="Wingdings" w:hAnsi="Wingdings" w:hint="default"/>
+        <w:sz w:val="20"/>
+      </w:rPr>
+    </w:lvl>
+    <w:lvl w:ilvl="6" w:tentative="1">
+      <w:start w:val="1"/>
+      <w:numFmt w:val="bullet"/>
+      <w:lvlText w:val=""/>
+      <w:lvlJc w:val="left"/>
+      <w:pPr>
+        <w:tabs>
+          <w:tab w:val="num" w:pos="5040"/>
+        </w:tabs>
+        <w:ind w:left="5040" w:hanging="360"/>
+      </w:pPr>
+      <w:rPr>
+        <w:rFonts w:ascii="Wingdings" w:hAnsi="Wingdings" w:hint="default"/>
+        <w:sz w:val="20"/>
+      </w:rPr>
+    </w:lvl>
+    <w:lvl w:ilvl="7" w:tentative="1">
+      <w:start w:val="1"/>
+      <w:numFmt w:val="bullet"/>
+      <w:lvlText w:val=""/>
+      <w:lvlJc w:val="left"/>
+      <w:pPr>
+        <w:tabs>
+          <w:tab w:val="num" w:pos="5760"/>
+        </w:tabs>
+        <w:ind w:left="5760" w:hanging="360"/>
+      </w:pPr>
+      <w:rPr>
+        <w:rFonts w:ascii="Wingdings" w:hAnsi="Wingdings" w:hint="default"/>
+        <w:sz w:val="20"/>
+      </w:rPr>
+    </w:lvl>
+    <w:lvl w:ilvl="8" w:tentative="1">
+      <w:start w:val="1"/>
+      <w:numFmt w:val="bullet"/>
+      <w:lvlText w:val=""/>
+      <w:lvlJc w:val="left"/>
+      <w:pPr>
+        <w:tabs>
+          <w:tab w:val="num" w:pos="6480"/>
+        </w:tabs>
+        <w:ind w:left="6480" w:hanging="360"/>
+      </w:pPr>
+      <w:rPr>
+        <w:rFonts w:ascii="Wingdings" w:hAnsi="Wingdings" w:hint="default"/>
+        <w:sz w:val="20"/>
+      </w:rPr>
+    </w:lvl>
+  </w:abstractNum>
+  <w:abstractNum w:abstractNumId="15" w15:restartNumberingAfterBreak="0">
+    <w:nsid w:val="73321BBA"/>
+    <w:multiLevelType w:val="multilevel"/>
+    <w:tmpl w:val="EFE6DFCA"/>
+    <w:lvl w:ilvl="0">
+      <w:start w:val="1"/>
+      <w:numFmt w:val="bullet"/>
+      <w:lvlText w:val=""/>
+      <w:lvlJc w:val="left"/>
+      <w:pPr>
+        <w:tabs>
+          <w:tab w:val="num" w:pos="720"/>
+        </w:tabs>
+        <w:ind w:left="720" w:hanging="360"/>
+      </w:pPr>
+      <w:rPr>
+        <w:rFonts w:ascii="Symbol" w:hAnsi="Symbol" w:hint="default"/>
+        <w:sz w:val="20"/>
+      </w:rPr>
+    </w:lvl>
+    <w:lvl w:ilvl="1" w:tentative="1">
+      <w:start w:val="1"/>
+      <w:numFmt w:val="bullet"/>
+      <w:lvlText w:val="o"/>
+      <w:lvlJc w:val="left"/>
+      <w:pPr>
+        <w:tabs>
+          <w:tab w:val="num" w:pos="1440"/>
+        </w:tabs>
+        <w:ind w:left="1440" w:hanging="360"/>
+      </w:pPr>
+      <w:rPr>
+        <w:rFonts w:ascii="Courier New" w:hAnsi="Courier New" w:hint="default"/>
+        <w:sz w:val="20"/>
+      </w:rPr>
+    </w:lvl>
+    <w:lvl w:ilvl="2" w:tentative="1">
+      <w:start w:val="1"/>
+      <w:numFmt w:val="bullet"/>
+      <w:lvlText w:val=""/>
+      <w:lvlJc w:val="left"/>
+      <w:pPr>
+        <w:tabs>
+          <w:tab w:val="num" w:pos="2160"/>
+        </w:tabs>
+        <w:ind w:left="2160" w:hanging="360"/>
+      </w:pPr>
+      <w:rPr>
+        <w:rFonts w:ascii="Wingdings" w:hAnsi="Wingdings" w:hint="default"/>
+        <w:sz w:val="20"/>
+      </w:rPr>
+    </w:lvl>
+    <w:lvl w:ilvl="3" w:tentative="1">
+      <w:start w:val="1"/>
+      <w:numFmt w:val="bullet"/>
+      <w:lvlText w:val=""/>
+      <w:lvlJc w:val="left"/>
+      <w:pPr>
+        <w:tabs>
+          <w:tab w:val="num" w:pos="2880"/>
+        </w:tabs>
+        <w:ind w:left="2880" w:hanging="360"/>
+      </w:pPr>
+      <w:rPr>
+        <w:rFonts w:ascii="Wingdings" w:hAnsi="Wingdings" w:hint="default"/>
+        <w:sz w:val="20"/>
+      </w:rPr>
+    </w:lvl>
+    <w:lvl w:ilvl="4" w:tentative="1">
+      <w:start w:val="1"/>
+      <w:numFmt w:val="bullet"/>
+      <w:lvlText w:val=""/>
+      <w:lvlJc w:val="left"/>
+      <w:pPr>
+        <w:tabs>
+          <w:tab w:val="num" w:pos="3600"/>
+        </w:tabs>
+        <w:ind w:left="3600" w:hanging="360"/>
+      </w:pPr>
+      <w:rPr>
+        <w:rFonts w:ascii="Wingdings" w:hAnsi="Wingdings" w:hint="default"/>
+        <w:sz w:val="20"/>
+      </w:rPr>
+    </w:lvl>
+    <w:lvl w:ilvl="5" w:tentative="1">
+      <w:start w:val="1"/>
+      <w:numFmt w:val="bullet"/>
+      <w:lvlText w:val=""/>
+      <w:lvlJc w:val="left"/>
+      <w:pPr>
+        <w:tabs>
+          <w:tab w:val="num" w:pos="4320"/>
+        </w:tabs>
+        <w:ind w:left="4320" w:hanging="360"/>
+      </w:pPr>
+      <w:rPr>
+        <w:rFonts w:ascii="Wingdings" w:hAnsi="Wingdings" w:hint="default"/>
+        <w:sz w:val="20"/>
+      </w:rPr>
+    </w:lvl>
+    <w:lvl w:ilvl="6" w:tentative="1">
+      <w:start w:val="1"/>
+      <w:numFmt w:val="bullet"/>
+      <w:lvlText w:val=""/>
+      <w:lvlJc w:val="left"/>
+      <w:pPr>
+        <w:tabs>
+          <w:tab w:val="num" w:pos="5040"/>
+        </w:tabs>
+        <w:ind w:left="5040" w:hanging="360"/>
+      </w:pPr>
+      <w:rPr>
+        <w:rFonts w:ascii="Wingdings" w:hAnsi="Wingdings" w:hint="default"/>
+        <w:sz w:val="20"/>
+      </w:rPr>
+    </w:lvl>
+    <w:lvl w:ilvl="7" w:tentative="1">
+      <w:start w:val="1"/>
+      <w:numFmt w:val="bullet"/>
+      <w:lvlText w:val=""/>
+      <w:lvlJc w:val="left"/>
+      <w:pPr>
+        <w:tabs>
+          <w:tab w:val="num" w:pos="5760"/>
+        </w:tabs>
+        <w:ind w:left="5760" w:hanging="360"/>
+      </w:pPr>
+      <w:rPr>
+        <w:rFonts w:ascii="Wingdings" w:hAnsi="Wingdings" w:hint="default"/>
+        <w:sz w:val="20"/>
+      </w:rPr>
+    </w:lvl>
+    <w:lvl w:ilvl="8" w:tentative="1">
+      <w:start w:val="1"/>
+      <w:numFmt w:val="bullet"/>
+      <w:lvlText w:val=""/>
+      <w:lvlJc w:val="left"/>
+      <w:pPr>
+        <w:tabs>
+          <w:tab w:val="num" w:pos="6480"/>
+        </w:tabs>
+        <w:ind w:left="6480" w:hanging="360"/>
+      </w:pPr>
+      <w:rPr>
+        <w:rFonts w:ascii="Wingdings" w:hAnsi="Wingdings" w:hint="default"/>
+        <w:sz w:val="20"/>
+      </w:rPr>
+    </w:lvl>
+  </w:abstractNum>
+  <w:abstractNum w:abstractNumId="16" w15:restartNumberingAfterBreak="0">
+    <w:nsid w:val="78BD4B0A"/>
+    <w:multiLevelType w:val="multilevel"/>
+    <w:tmpl w:val="0E5AF6F0"/>
+    <w:lvl w:ilvl="0">
+      <w:start w:val="1"/>
+      <w:numFmt w:val="bullet"/>
+      <w:lvlText w:val=""/>
+      <w:lvlJc w:val="left"/>
+      <w:pPr>
+        <w:tabs>
+          <w:tab w:val="num" w:pos="720"/>
+        </w:tabs>
+        <w:ind w:left="720" w:hanging="360"/>
+      </w:pPr>
+      <w:rPr>
+        <w:rFonts w:ascii="Symbol" w:hAnsi="Symbol" w:hint="default"/>
+        <w:sz w:val="20"/>
+      </w:rPr>
+    </w:lvl>
+    <w:lvl w:ilvl="1">
+      <w:start w:val="1"/>
+      <w:numFmt w:val="bullet"/>
+      <w:lvlText w:val="o"/>
+      <w:lvlJc w:val="left"/>
+      <w:pPr>
+        <w:tabs>
+          <w:tab w:val="num" w:pos="1440"/>
+        </w:tabs>
+        <w:ind w:left="1440" w:hanging="360"/>
+      </w:pPr>
+      <w:rPr>
+        <w:rFonts w:ascii="Courier New" w:hAnsi="Courier New" w:hint="default"/>
+        <w:sz w:val="20"/>
+      </w:rPr>
+    </w:lvl>
+    <w:lvl w:ilvl="2" w:tentative="1">
+      <w:start w:val="1"/>
+      <w:numFmt w:val="bullet"/>
+      <w:lvlText w:val=""/>
+      <w:lvlJc w:val="left"/>
+      <w:pPr>
+        <w:tabs>
+          <w:tab w:val="num" w:pos="2160"/>
+        </w:tabs>
+        <w:ind w:left="2160" w:hanging="360"/>
+      </w:pPr>
+      <w:rPr>
+        <w:rFonts w:ascii="Wingdings" w:hAnsi="Wingdings" w:hint="default"/>
+        <w:sz w:val="20"/>
+      </w:rPr>
+    </w:lvl>
+    <w:lvl w:ilvl="3" w:tentative="1">
+      <w:start w:val="1"/>
+      <w:numFmt w:val="bullet"/>
+      <w:lvlText w:val=""/>
+      <w:lvlJc w:val="left"/>
+      <w:pPr>
+        <w:tabs>
+          <w:tab w:val="num" w:pos="2880"/>
+        </w:tabs>
+        <w:ind w:left="2880" w:hanging="360"/>
+      </w:pPr>
+      <w:rPr>
+        <w:rFonts w:ascii="Wingdings" w:hAnsi="Wingdings" w:hint="default"/>
+        <w:sz w:val="20"/>
+      </w:rPr>
+    </w:lvl>
+    <w:lvl w:ilvl="4" w:tentative="1">
+      <w:start w:val="1"/>
+      <w:numFmt w:val="bullet"/>
+      <w:lvlText w:val=""/>
+      <w:lvlJc w:val="left"/>
+      <w:pPr>
+        <w:tabs>
+          <w:tab w:val="num" w:pos="3600"/>
+        </w:tabs>
+        <w:ind w:left="3600" w:hanging="360"/>
+      </w:pPr>
+      <w:rPr>
+        <w:rFonts w:ascii="Wingdings" w:hAnsi="Wingdings" w:hint="default"/>
+        <w:sz w:val="20"/>
+      </w:rPr>
+    </w:lvl>
+    <w:lvl w:ilvl="5" w:tentative="1">
+      <w:start w:val="1"/>
+      <w:numFmt w:val="bullet"/>
+      <w:lvlText w:val=""/>
+      <w:lvlJc w:val="left"/>
+      <w:pPr>
+        <w:tabs>
+          <w:tab w:val="num" w:pos="4320"/>
+        </w:tabs>
+        <w:ind w:left="4320" w:hanging="360"/>
+      </w:pPr>
+      <w:rPr>
+        <w:rFonts w:ascii="Wingdings" w:hAnsi="Wingdings" w:hint="default"/>
+        <w:sz w:val="20"/>
+      </w:rPr>
+    </w:lvl>
+    <w:lvl w:ilvl="6" w:tentative="1">
+      <w:start w:val="1"/>
+      <w:numFmt w:val="bullet"/>
+      <w:lvlText w:val=""/>
+      <w:lvlJc w:val="left"/>
+      <w:pPr>
+        <w:tabs>
+          <w:tab w:val="num" w:pos="5040"/>
+        </w:tabs>
+        <w:ind w:left="5040" w:hanging="360"/>
+      </w:pPr>
+      <w:rPr>
+        <w:rFonts w:ascii="Wingdings" w:hAnsi="Wingdings" w:hint="default"/>
+        <w:sz w:val="20"/>
+      </w:rPr>
+    </w:lvl>
+    <w:lvl w:ilvl="7" w:tentative="1">
+      <w:start w:val="1"/>
+      <w:numFmt w:val="bullet"/>
+      <w:lvlText w:val=""/>
+      <w:lvlJc w:val="left"/>
+      <w:pPr>
+        <w:tabs>
+          <w:tab w:val="num" w:pos="5760"/>
+        </w:tabs>
+        <w:ind w:left="5760" w:hanging="360"/>
+      </w:pPr>
+      <w:rPr>
+        <w:rFonts w:ascii="Wingdings" w:hAnsi="Wingdings" w:hint="default"/>
+        <w:sz w:val="20"/>
+      </w:rPr>
+    </w:lvl>
+    <w:lvl w:ilvl="8" w:tentative="1">
+      <w:start w:val="1"/>
+      <w:numFmt w:val="bullet"/>
+      <w:lvlText w:val=""/>
+      <w:lvlJc w:val="left"/>
+      <w:pPr>
+        <w:tabs>
+          <w:tab w:val="num" w:pos="6480"/>
+        </w:tabs>
+        <w:ind w:left="6480" w:hanging="360"/>
+      </w:pPr>
+      <w:rPr>
+        <w:rFonts w:ascii="Wingdings" w:hAnsi="Wingdings" w:hint="default"/>
+        <w:sz w:val="20"/>
+      </w:rPr>
+    </w:lvl>
+  </w:abstractNum>
+  <w:abstractNum w:abstractNumId="17" w15:restartNumberingAfterBreak="0">
+    <w:nsid w:val="79FD2B7C"/>
+    <w:multiLevelType w:val="multilevel"/>
+    <w:tmpl w:val="FEC8E97E"/>
+    <w:lvl w:ilvl="0">
+      <w:start w:val="1"/>
+      <w:numFmt w:val="bullet"/>
+      <w:lvlText w:val=""/>
+      <w:lvlJc w:val="left"/>
+      <w:pPr>
+        <w:tabs>
+          <w:tab w:val="num" w:pos="720"/>
+        </w:tabs>
+        <w:ind w:left="720" w:hanging="360"/>
+      </w:pPr>
+      <w:rPr>
+        <w:rFonts w:ascii="Symbol" w:hAnsi="Symbol" w:hint="default"/>
+        <w:sz w:val="20"/>
+      </w:rPr>
+    </w:lvl>
+    <w:lvl w:ilvl="1" w:tentative="1">
+      <w:start w:val="1"/>
+      <w:numFmt w:val="bullet"/>
+      <w:lvlText w:val="o"/>
+      <w:lvlJc w:val="left"/>
+      <w:pPr>
+        <w:tabs>
+          <w:tab w:val="num" w:pos="1440"/>
+        </w:tabs>
+        <w:ind w:left="1440" w:hanging="360"/>
+      </w:pPr>
+      <w:rPr>
+        <w:rFonts w:ascii="Courier New" w:hAnsi="Courier New" w:hint="default"/>
+        <w:sz w:val="20"/>
+      </w:rPr>
+    </w:lvl>
+    <w:lvl w:ilvl="2" w:tentative="1">
+      <w:start w:val="1"/>
+      <w:numFmt w:val="bullet"/>
+      <w:lvlText w:val=""/>
+      <w:lvlJc w:val="left"/>
+      <w:pPr>
+        <w:tabs>
+          <w:tab w:val="num" w:pos="2160"/>
+        </w:tabs>
+        <w:ind w:left="2160" w:hanging="360"/>
+      </w:pPr>
+      <w:rPr>
+        <w:rFonts w:ascii="Wingdings" w:hAnsi="Wingdings" w:hint="default"/>
+        <w:sz w:val="20"/>
+      </w:rPr>
+    </w:lvl>
+    <w:lvl w:ilvl="3" w:tentative="1">
+      <w:start w:val="1"/>
+      <w:numFmt w:val="bullet"/>
+      <w:lvlText w:val=""/>
+      <w:lvlJc w:val="left"/>
+      <w:pPr>
+        <w:tabs>
+          <w:tab w:val="num" w:pos="2880"/>
+        </w:tabs>
+        <w:ind w:left="2880" w:hanging="360"/>
+      </w:pPr>
+      <w:rPr>
+        <w:rFonts w:ascii="Wingdings" w:hAnsi="Wingdings" w:hint="default"/>
+        <w:sz w:val="20"/>
+      </w:rPr>
+    </w:lvl>
+    <w:lvl w:ilvl="4" w:tentative="1">
+      <w:start w:val="1"/>
+      <w:numFmt w:val="bullet"/>
+      <w:lvlText w:val=""/>
+      <w:lvlJc w:val="left"/>
+      <w:pPr>
+        <w:tabs>
+          <w:tab w:val="num" w:pos="3600"/>
+        </w:tabs>
+        <w:ind w:left="3600" w:hanging="360"/>
+      </w:pPr>
+      <w:rPr>
+        <w:rFonts w:ascii="Wingdings" w:hAnsi="Wingdings" w:hint="default"/>
+        <w:sz w:val="20"/>
+      </w:rPr>
+    </w:lvl>
+    <w:lvl w:ilvl="5" w:tentative="1">
+      <w:start w:val="1"/>
+      <w:numFmt w:val="bullet"/>
+      <w:lvlText w:val=""/>
+      <w:lvlJc w:val="left"/>
+      <w:pPr>
+        <w:tabs>
+          <w:tab w:val="num" w:pos="4320"/>
+        </w:tabs>
+        <w:ind w:left="4320" w:hanging="360"/>
+      </w:pPr>
+      <w:rPr>
+        <w:rFonts w:ascii="Wingdings" w:hAnsi="Wingdings" w:hint="default"/>
+        <w:sz w:val="20"/>
+      </w:rPr>
+    </w:lvl>
+    <w:lvl w:ilvl="6" w:tentative="1">
+      <w:start w:val="1"/>
+      <w:numFmt w:val="bullet"/>
+      <w:lvlText w:val=""/>
+      <w:lvlJc w:val="left"/>
+      <w:pPr>
+        <w:tabs>
+          <w:tab w:val="num" w:pos="5040"/>
+        </w:tabs>
+        <w:ind w:left="5040" w:hanging="360"/>
+      </w:pPr>
+      <w:rPr>
+        <w:rFonts w:ascii="Wingdings" w:hAnsi="Wingdings" w:hint="default"/>
+        <w:sz w:val="20"/>
+      </w:rPr>
+    </w:lvl>
+    <w:lvl w:ilvl="7" w:tentative="1">
+      <w:start w:val="1"/>
+      <w:numFmt w:val="bullet"/>
+      <w:lvlText w:val=""/>
+      <w:lvlJc w:val="left"/>
+      <w:pPr>
+        <w:tabs>
+          <w:tab w:val="num" w:pos="5760"/>
+        </w:tabs>
+        <w:ind w:left="5760" w:hanging="360"/>
+      </w:pPr>
+      <w:rPr>
+        <w:rFonts w:ascii="Wingdings" w:hAnsi="Wingdings" w:hint="default"/>
+        <w:sz w:val="20"/>
+      </w:rPr>
+    </w:lvl>
+    <w:lvl w:ilvl="8" w:tentative="1">
+      <w:start w:val="1"/>
+      <w:numFmt w:val="bullet"/>
+      <w:lvlText w:val=""/>
+      <w:lvlJc w:val="left"/>
+      <w:pPr>
+        <w:tabs>
+          <w:tab w:val="num" w:pos="6480"/>
+        </w:tabs>
+        <w:ind w:left="6480" w:hanging="360"/>
+      </w:pPr>
+      <w:rPr>
+        <w:rFonts w:ascii="Wingdings" w:hAnsi="Wingdings" w:hint="default"/>
+        <w:sz w:val="20"/>
+      </w:rPr>
+    </w:lvl>
+  </w:abstractNum>
+  <w:num w:numId="1" w16cid:durableId="1651977992">
+    <w:abstractNumId w:val="15"/>
+  </w:num>
+  <w:num w:numId="2" w16cid:durableId="222713874">
+    <w:abstractNumId w:val="0"/>
+  </w:num>
+  <w:num w:numId="3" w16cid:durableId="1897811804">
+    <w:abstractNumId w:val="16"/>
+  </w:num>
+  <w:num w:numId="4" w16cid:durableId="480998893">
+    <w:abstractNumId w:val="10"/>
+  </w:num>
+  <w:num w:numId="5" w16cid:durableId="627710897">
+    <w:abstractNumId w:val="9"/>
+  </w:num>
+  <w:num w:numId="6" w16cid:durableId="1650670057">
+    <w:abstractNumId w:val="3"/>
+  </w:num>
+  <w:num w:numId="7" w16cid:durableId="1062102917">
+    <w:abstractNumId w:val="14"/>
+  </w:num>
+  <w:num w:numId="8" w16cid:durableId="879586373">
+    <w:abstractNumId w:val="5"/>
+  </w:num>
+  <w:num w:numId="9" w16cid:durableId="1369069069">
+    <w:abstractNumId w:val="12"/>
+  </w:num>
+  <w:num w:numId="10" w16cid:durableId="245656287">
+    <w:abstractNumId w:val="17"/>
+  </w:num>
+  <w:num w:numId="11" w16cid:durableId="435977825">
+    <w:abstractNumId w:val="7"/>
+  </w:num>
+  <w:num w:numId="12" w16cid:durableId="1315985183">
+    <w:abstractNumId w:val="6"/>
+  </w:num>
+  <w:num w:numId="13" w16cid:durableId="1158885373">
+    <w:abstractNumId w:val="2"/>
+  </w:num>
+  <w:num w:numId="14" w16cid:durableId="1310137639">
+    <w:abstractNumId w:val="8"/>
+  </w:num>
+  <w:num w:numId="15" w16cid:durableId="248657663">
+    <w:abstractNumId w:val="4"/>
+  </w:num>
+  <w:num w:numId="16" w16cid:durableId="1338919693">
+    <w:abstractNumId w:val="1"/>
+  </w:num>
+  <w:num w:numId="17" w16cid:durableId="1705866966">
+    <w:abstractNumId w:val="13"/>
+  </w:num>
+  <w:num w:numId="18" w16cid:durableId="1640526705">
+    <w:abstractNumId w:val="11"/>
+  </w:num>
+</w:numbering>
 </file>
 
 <file path=word/styles.xml><?xml version="1.0" encoding="utf-8"?>
@@ -673,7 +3965,6 @@
   <w:style w:type="character" w:default="1" w:styleId="DefaultParagraphFont">
     <w:name w:val="Default Paragraph Font"/>
     <w:uiPriority w:val="1"/>
-    <w:semiHidden/>
     <w:unhideWhenUsed/>
   </w:style>
   <w:style w:type="table" w:default="1" w:styleId="TableNormal">
@@ -987,6 +4278,25 @@
       <w:spacing w:val="5"/>
     </w:rPr>
   </w:style>
+  <w:style w:type="table" w:styleId="TableGrid">
+    <w:name w:val="Table Grid"/>
+    <w:basedOn w:val="TableNormal"/>
+    <w:uiPriority w:val="39"/>
+    <w:rsid w:val="002A68F5"/>
+    <w:pPr>
+      <w:spacing w:after="0" w:line="240" w:lineRule="auto"/>
+    </w:pPr>
+    <w:tblPr>
+      <w:tblBorders>
+        <w:top w:val="single" w:sz="4" w:space="0" w:color="auto"/>
+        <w:left w:val="single" w:sz="4" w:space="0" w:color="auto"/>
+        <w:bottom w:val="single" w:sz="4" w:space="0" w:color="auto"/>
+        <w:right w:val="single" w:sz="4" w:space="0" w:color="auto"/>
+        <w:insideH w:val="single" w:sz="4" w:space="0" w:color="auto"/>
+        <w:insideV w:val="single" w:sz="4" w:space="0" w:color="auto"/>
+      </w:tblBorders>
+    </w:tblPr>
+  </w:style>
 </w:styles>
 </file>
 

</xml_diff>

<commit_message>
609 completing section 1
</commit_message>
<xml_diff>
--- a/2026-T3/B2-ICTSAD609-Plan_Monitor/2-Task2/Task2.docx
+++ b/2026-T3/B2-ICTSAD609-Plan_Monitor/2-Task2/Task2.docx
@@ -7704,7 +7704,9 @@
           <w:szCs w:val="22"/>
         </w:rPr>
       </w:pPr>
-      <w:r>
+    </w:p>
+    <w:p>
+      <w:pPr>
         <w:rPr>
           <w:rFonts w:ascii="Arial" w:hAnsi="Arial" w:cs="Arial"/>
           <w:b/>
@@ -7712,244 +7714,8 @@
           <w:sz w:val="22"/>
           <w:szCs w:val="22"/>
         </w:rPr>
-        <w:t>Engagement with Personnel</w:t>
-      </w:r>
-    </w:p>
-    <w:p>
-      <w:pPr>
-        <w:rPr>
-          <w:rFonts w:ascii="Arial" w:hAnsi="Arial" w:cs="Arial"/>
-          <w:sz w:val="22"/>
-          <w:szCs w:val="22"/>
-        </w:rPr>
-      </w:pPr>
-    </w:p>
-    <w:p>
-      <w:pPr>
-        <w:rPr>
-          <w:rFonts w:ascii="Arial" w:hAnsi="Arial" w:cs="Arial"/>
-          <w:sz w:val="22"/>
-          <w:szCs w:val="22"/>
-        </w:rPr>
-      </w:pPr>
-      <w:r>
-        <w:rPr>
-          <w:rFonts w:ascii="Arial" w:hAnsi="Arial" w:cs="Arial"/>
-          <w:sz w:val="22"/>
-          <w:szCs w:val="22"/>
-        </w:rPr>
-        <w:t xml:space="preserve">It was initiated by a formal approval email request to Senior Management and Founders, requesting authorisation to proceed with </w:t>
-      </w:r>
-      <w:r>
-        <w:rPr>
-          <w:rFonts w:ascii="Arial" w:hAnsi="Arial" w:cs="Arial"/>
-          <w:sz w:val="22"/>
-          <w:szCs w:val="22"/>
-        </w:rPr>
-        <w:t>Cloud-First SaaS and B2C initiative</w:t>
-      </w:r>
-      <w:r>
-        <w:rPr>
-          <w:rFonts w:ascii="Arial" w:hAnsi="Arial" w:cs="Arial"/>
-          <w:sz w:val="22"/>
-          <w:szCs w:val="22"/>
-        </w:rPr>
-        <w:t>, see “</w:t>
-      </w:r>
-      <w:r>
-        <w:rPr>
-          <w:rFonts w:ascii="Arial" w:hAnsi="Arial" w:cs="Arial"/>
-          <w:sz w:val="22"/>
-          <w:szCs w:val="22"/>
-        </w:rPr>
-        <w:t>Initiative</w:t>
-      </w:r>
-      <w:r>
-        <w:rPr>
-          <w:rFonts w:ascii="Arial" w:hAnsi="Arial" w:cs="Arial"/>
-          <w:sz w:val="22"/>
-          <w:szCs w:val="22"/>
-        </w:rPr>
-        <w:t>1</w:t>
-      </w:r>
-      <w:r>
-        <w:rPr>
-          <w:rFonts w:ascii="Arial" w:hAnsi="Arial" w:cs="Arial"/>
-          <w:sz w:val="22"/>
-          <w:szCs w:val="22"/>
-        </w:rPr>
-        <w:t>_Engagement_</w:t>
-      </w:r>
-      <w:r>
-        <w:rPr>
-          <w:rFonts w:ascii="Arial" w:hAnsi="Arial" w:cs="Arial"/>
-          <w:sz w:val="22"/>
-          <w:szCs w:val="22"/>
-        </w:rPr>
-        <w:t xml:space="preserve">email”. Also, for </w:t>
-      </w:r>
-      <w:r>
-        <w:rPr>
-          <w:rFonts w:ascii="Arial" w:hAnsi="Arial" w:cs="Arial"/>
-          <w:sz w:val="22"/>
-          <w:szCs w:val="22"/>
-        </w:rPr>
-        <w:t>Strategic Hardware Partnerships and Outsourced Distribution</w:t>
-      </w:r>
-      <w:r>
-        <w:rPr>
-          <w:rFonts w:ascii="Arial" w:hAnsi="Arial" w:cs="Arial"/>
-          <w:sz w:val="22"/>
-          <w:szCs w:val="22"/>
-        </w:rPr>
-        <w:t xml:space="preserve"> initiative was requested by </w:t>
-      </w:r>
-      <w:proofErr w:type="gramStart"/>
-      <w:r>
-        <w:rPr>
-          <w:rFonts w:ascii="Arial" w:hAnsi="Arial" w:cs="Arial"/>
-          <w:sz w:val="22"/>
-          <w:szCs w:val="22"/>
-        </w:rPr>
-        <w:t>a</w:t>
-      </w:r>
-      <w:proofErr w:type="gramEnd"/>
-      <w:r>
-        <w:rPr>
-          <w:rFonts w:ascii="Arial" w:hAnsi="Arial" w:cs="Arial"/>
-          <w:sz w:val="22"/>
-          <w:szCs w:val="22"/>
-        </w:rPr>
-        <w:t xml:space="preserve"> email to Noah Jones (operations team manager) and Victorine </w:t>
-      </w:r>
-      <w:proofErr w:type="spellStart"/>
-      <w:r>
-        <w:rPr>
-          <w:rFonts w:ascii="Arial" w:hAnsi="Arial" w:cs="Arial"/>
-          <w:sz w:val="22"/>
-          <w:szCs w:val="22"/>
-        </w:rPr>
-        <w:t>Satore</w:t>
-      </w:r>
-      <w:proofErr w:type="spellEnd"/>
-      <w:r>
-        <w:rPr>
-          <w:rFonts w:ascii="Arial" w:hAnsi="Arial" w:cs="Arial"/>
-          <w:sz w:val="22"/>
-          <w:szCs w:val="22"/>
-        </w:rPr>
-        <w:t xml:space="preserve"> (Team sales manager) to meeting and discuss. See “</w:t>
-      </w:r>
-      <w:r>
-        <w:rPr>
-          <w:rFonts w:ascii="Arial" w:hAnsi="Arial" w:cs="Arial"/>
-          <w:sz w:val="22"/>
-          <w:szCs w:val="22"/>
-        </w:rPr>
-        <w:t>Initiative2_Engagement_</w:t>
-      </w:r>
-      <w:r>
-        <w:rPr>
-          <w:rFonts w:ascii="Arial" w:hAnsi="Arial" w:cs="Arial"/>
-          <w:sz w:val="22"/>
-          <w:szCs w:val="22"/>
-        </w:rPr>
-        <w:t>e</w:t>
-      </w:r>
-      <w:r>
-        <w:rPr>
-          <w:rFonts w:ascii="Arial" w:hAnsi="Arial" w:cs="Arial"/>
-          <w:sz w:val="22"/>
-          <w:szCs w:val="22"/>
-        </w:rPr>
-        <w:t>mail</w:t>
-      </w:r>
-      <w:r>
-        <w:rPr>
-          <w:rFonts w:ascii="Arial" w:hAnsi="Arial" w:cs="Arial"/>
-          <w:sz w:val="22"/>
-          <w:szCs w:val="22"/>
-        </w:rPr>
-        <w:t>”.</w:t>
-      </w:r>
-    </w:p>
-    <w:p>
-      <w:pPr>
-        <w:rPr>
-          <w:rFonts w:ascii="Arial" w:hAnsi="Arial" w:cs="Arial"/>
-          <w:sz w:val="22"/>
-          <w:szCs w:val="22"/>
-        </w:rPr>
-      </w:pPr>
-    </w:p>
-    <w:p>
-      <w:pPr>
-        <w:rPr>
-          <w:rFonts w:ascii="Arial" w:hAnsi="Arial" w:cs="Arial"/>
-          <w:sz w:val="22"/>
-          <w:szCs w:val="22"/>
-        </w:rPr>
-      </w:pPr>
-      <w:r>
-        <w:rPr>
-          <w:rFonts w:ascii="Arial" w:hAnsi="Arial" w:cs="Arial"/>
-          <w:sz w:val="22"/>
-          <w:szCs w:val="22"/>
-        </w:rPr>
-        <w:t>Details of the</w:t>
-      </w:r>
-      <w:r>
-        <w:rPr>
-          <w:rFonts w:ascii="Arial" w:hAnsi="Arial" w:cs="Arial"/>
-          <w:sz w:val="22"/>
-          <w:szCs w:val="22"/>
-        </w:rPr>
-        <w:t xml:space="preserve"> feedback </w:t>
-      </w:r>
-      <w:r>
-        <w:rPr>
-          <w:rFonts w:ascii="Arial" w:hAnsi="Arial" w:cs="Arial"/>
-          <w:sz w:val="22"/>
-          <w:szCs w:val="22"/>
-        </w:rPr>
-        <w:t>are in “</w:t>
-      </w:r>
-      <w:r>
-        <w:rPr>
-          <w:rFonts w:ascii="Arial" w:hAnsi="Arial" w:cs="Arial"/>
-          <w:sz w:val="22"/>
-          <w:szCs w:val="22"/>
-        </w:rPr>
-        <w:t>Stakeholders-Feedback-Register</w:t>
-      </w:r>
-      <w:r>
-        <w:rPr>
-          <w:rFonts w:ascii="Arial" w:hAnsi="Arial" w:cs="Arial"/>
-          <w:sz w:val="22"/>
-          <w:szCs w:val="22"/>
-        </w:rPr>
-        <w:t>”</w:t>
-      </w:r>
-      <w:r>
-        <w:rPr>
-          <w:rFonts w:ascii="Arial" w:hAnsi="Arial" w:cs="Arial"/>
-          <w:sz w:val="22"/>
-          <w:szCs w:val="22"/>
-        </w:rPr>
-        <w:t>.</w:t>
-      </w:r>
-    </w:p>
-    <w:p>
-      <w:pPr>
-        <w:rPr>
-          <w:rFonts w:ascii="Arial" w:hAnsi="Arial" w:cs="Arial"/>
-          <w:sz w:val="22"/>
-          <w:szCs w:val="22"/>
-        </w:rPr>
-      </w:pPr>
-    </w:p>
-    <w:p>
-      <w:pPr>
+      </w:pPr>
+      <w:r>
         <w:rPr>
           <w:rFonts w:ascii="Arial" w:hAnsi="Arial" w:cs="Arial"/>
           <w:b/>
@@ -7957,8 +7723,244 @@
           <w:sz w:val="22"/>
           <w:szCs w:val="22"/>
         </w:rPr>
-      </w:pPr>
-      <w:r>
+        <w:t>Engagement with Personnel</w:t>
+      </w:r>
+    </w:p>
+    <w:p>
+      <w:pPr>
+        <w:rPr>
+          <w:rFonts w:ascii="Arial" w:hAnsi="Arial" w:cs="Arial"/>
+          <w:sz w:val="22"/>
+          <w:szCs w:val="22"/>
+        </w:rPr>
+      </w:pPr>
+    </w:p>
+    <w:p>
+      <w:pPr>
+        <w:rPr>
+          <w:rFonts w:ascii="Arial" w:hAnsi="Arial" w:cs="Arial"/>
+          <w:sz w:val="22"/>
+          <w:szCs w:val="22"/>
+        </w:rPr>
+      </w:pPr>
+      <w:r>
+        <w:rPr>
+          <w:rFonts w:ascii="Arial" w:hAnsi="Arial" w:cs="Arial"/>
+          <w:sz w:val="22"/>
+          <w:szCs w:val="22"/>
+        </w:rPr>
+        <w:t xml:space="preserve">It was initiated by a formal approval email request to Senior Management and Founders, requesting authorisation to proceed with </w:t>
+      </w:r>
+      <w:r>
+        <w:rPr>
+          <w:rFonts w:ascii="Arial" w:hAnsi="Arial" w:cs="Arial"/>
+          <w:sz w:val="22"/>
+          <w:szCs w:val="22"/>
+        </w:rPr>
+        <w:t>Cloud-First SaaS and B2C initiative</w:t>
+      </w:r>
+      <w:r>
+        <w:rPr>
+          <w:rFonts w:ascii="Arial" w:hAnsi="Arial" w:cs="Arial"/>
+          <w:sz w:val="22"/>
+          <w:szCs w:val="22"/>
+        </w:rPr>
+        <w:t>, see “</w:t>
+      </w:r>
+      <w:r>
+        <w:rPr>
+          <w:rFonts w:ascii="Arial" w:hAnsi="Arial" w:cs="Arial"/>
+          <w:sz w:val="22"/>
+          <w:szCs w:val="22"/>
+        </w:rPr>
+        <w:t>Initiative</w:t>
+      </w:r>
+      <w:r>
+        <w:rPr>
+          <w:rFonts w:ascii="Arial" w:hAnsi="Arial" w:cs="Arial"/>
+          <w:sz w:val="22"/>
+          <w:szCs w:val="22"/>
+        </w:rPr>
+        <w:t>1</w:t>
+      </w:r>
+      <w:r>
+        <w:rPr>
+          <w:rFonts w:ascii="Arial" w:hAnsi="Arial" w:cs="Arial"/>
+          <w:sz w:val="22"/>
+          <w:szCs w:val="22"/>
+        </w:rPr>
+        <w:t>_Engagement_</w:t>
+      </w:r>
+      <w:r>
+        <w:rPr>
+          <w:rFonts w:ascii="Arial" w:hAnsi="Arial" w:cs="Arial"/>
+          <w:sz w:val="22"/>
+          <w:szCs w:val="22"/>
+        </w:rPr>
+        <w:t xml:space="preserve">email”. Also, for </w:t>
+      </w:r>
+      <w:r>
+        <w:rPr>
+          <w:rFonts w:ascii="Arial" w:hAnsi="Arial" w:cs="Arial"/>
+          <w:sz w:val="22"/>
+          <w:szCs w:val="22"/>
+        </w:rPr>
+        <w:t>Strategic Hardware Partnerships and Outsourced Distribution</w:t>
+      </w:r>
+      <w:r>
+        <w:rPr>
+          <w:rFonts w:ascii="Arial" w:hAnsi="Arial" w:cs="Arial"/>
+          <w:sz w:val="22"/>
+          <w:szCs w:val="22"/>
+        </w:rPr>
+        <w:t xml:space="preserve"> initiative was requested by </w:t>
+      </w:r>
+      <w:proofErr w:type="gramStart"/>
+      <w:r>
+        <w:rPr>
+          <w:rFonts w:ascii="Arial" w:hAnsi="Arial" w:cs="Arial"/>
+          <w:sz w:val="22"/>
+          <w:szCs w:val="22"/>
+        </w:rPr>
+        <w:t>a</w:t>
+      </w:r>
+      <w:proofErr w:type="gramEnd"/>
+      <w:r>
+        <w:rPr>
+          <w:rFonts w:ascii="Arial" w:hAnsi="Arial" w:cs="Arial"/>
+          <w:sz w:val="22"/>
+          <w:szCs w:val="22"/>
+        </w:rPr>
+        <w:t xml:space="preserve"> email to Noah Jones (operations team manager) and Victorine </w:t>
+      </w:r>
+      <w:proofErr w:type="spellStart"/>
+      <w:r>
+        <w:rPr>
+          <w:rFonts w:ascii="Arial" w:hAnsi="Arial" w:cs="Arial"/>
+          <w:sz w:val="22"/>
+          <w:szCs w:val="22"/>
+        </w:rPr>
+        <w:t>Satore</w:t>
+      </w:r>
+      <w:proofErr w:type="spellEnd"/>
+      <w:r>
+        <w:rPr>
+          <w:rFonts w:ascii="Arial" w:hAnsi="Arial" w:cs="Arial"/>
+          <w:sz w:val="22"/>
+          <w:szCs w:val="22"/>
+        </w:rPr>
+        <w:t xml:space="preserve"> (Team sales manager) to meeting and discuss. See “</w:t>
+      </w:r>
+      <w:r>
+        <w:rPr>
+          <w:rFonts w:ascii="Arial" w:hAnsi="Arial" w:cs="Arial"/>
+          <w:sz w:val="22"/>
+          <w:szCs w:val="22"/>
+        </w:rPr>
+        <w:t>Initiative2_Engagement_</w:t>
+      </w:r>
+      <w:r>
+        <w:rPr>
+          <w:rFonts w:ascii="Arial" w:hAnsi="Arial" w:cs="Arial"/>
+          <w:sz w:val="22"/>
+          <w:szCs w:val="22"/>
+        </w:rPr>
+        <w:t>e</w:t>
+      </w:r>
+      <w:r>
+        <w:rPr>
+          <w:rFonts w:ascii="Arial" w:hAnsi="Arial" w:cs="Arial"/>
+          <w:sz w:val="22"/>
+          <w:szCs w:val="22"/>
+        </w:rPr>
+        <w:t>mail</w:t>
+      </w:r>
+      <w:r>
+        <w:rPr>
+          <w:rFonts w:ascii="Arial" w:hAnsi="Arial" w:cs="Arial"/>
+          <w:sz w:val="22"/>
+          <w:szCs w:val="22"/>
+        </w:rPr>
+        <w:t>”.</w:t>
+      </w:r>
+    </w:p>
+    <w:p>
+      <w:pPr>
+        <w:rPr>
+          <w:rFonts w:ascii="Arial" w:hAnsi="Arial" w:cs="Arial"/>
+          <w:sz w:val="22"/>
+          <w:szCs w:val="22"/>
+        </w:rPr>
+      </w:pPr>
+    </w:p>
+    <w:p>
+      <w:pPr>
+        <w:rPr>
+          <w:rFonts w:ascii="Arial" w:hAnsi="Arial" w:cs="Arial"/>
+          <w:sz w:val="22"/>
+          <w:szCs w:val="22"/>
+        </w:rPr>
+      </w:pPr>
+      <w:r>
+        <w:rPr>
+          <w:rFonts w:ascii="Arial" w:hAnsi="Arial" w:cs="Arial"/>
+          <w:sz w:val="22"/>
+          <w:szCs w:val="22"/>
+        </w:rPr>
+        <w:t>Details of the</w:t>
+      </w:r>
+      <w:r>
+        <w:rPr>
+          <w:rFonts w:ascii="Arial" w:hAnsi="Arial" w:cs="Arial"/>
+          <w:sz w:val="22"/>
+          <w:szCs w:val="22"/>
+        </w:rPr>
+        <w:t xml:space="preserve"> feedback </w:t>
+      </w:r>
+      <w:r>
+        <w:rPr>
+          <w:rFonts w:ascii="Arial" w:hAnsi="Arial" w:cs="Arial"/>
+          <w:sz w:val="22"/>
+          <w:szCs w:val="22"/>
+        </w:rPr>
+        <w:t>are in “</w:t>
+      </w:r>
+      <w:r>
+        <w:rPr>
+          <w:rFonts w:ascii="Arial" w:hAnsi="Arial" w:cs="Arial"/>
+          <w:sz w:val="22"/>
+          <w:szCs w:val="22"/>
+        </w:rPr>
+        <w:t>Stakeholders-Feedback-Register</w:t>
+      </w:r>
+      <w:r>
+        <w:rPr>
+          <w:rFonts w:ascii="Arial" w:hAnsi="Arial" w:cs="Arial"/>
+          <w:sz w:val="22"/>
+          <w:szCs w:val="22"/>
+        </w:rPr>
+        <w:t>”</w:t>
+      </w:r>
+      <w:r>
+        <w:rPr>
+          <w:rFonts w:ascii="Arial" w:hAnsi="Arial" w:cs="Arial"/>
+          <w:sz w:val="22"/>
+          <w:szCs w:val="22"/>
+        </w:rPr>
+        <w:t>.</w:t>
+      </w:r>
+    </w:p>
+    <w:p>
+      <w:pPr>
+        <w:rPr>
+          <w:rFonts w:ascii="Arial" w:hAnsi="Arial" w:cs="Arial"/>
+          <w:sz w:val="22"/>
+          <w:szCs w:val="22"/>
+        </w:rPr>
+      </w:pPr>
+    </w:p>
+    <w:p>
+      <w:pPr>
         <w:rPr>
           <w:rFonts w:ascii="Arial" w:hAnsi="Arial" w:cs="Arial"/>
           <w:b/>
@@ -7966,6 +7968,26 @@
           <w:sz w:val="22"/>
           <w:szCs w:val="22"/>
         </w:rPr>
+      </w:pPr>
+    </w:p>
+    <w:p>
+      <w:pPr>
+        <w:rPr>
+          <w:rFonts w:ascii="Arial" w:hAnsi="Arial" w:cs="Arial"/>
+          <w:b/>
+          <w:bCs/>
+          <w:sz w:val="22"/>
+          <w:szCs w:val="22"/>
+        </w:rPr>
+      </w:pPr>
+      <w:r>
+        <w:rPr>
+          <w:rFonts w:ascii="Arial" w:hAnsi="Arial" w:cs="Arial"/>
+          <w:b/>
+          <w:bCs/>
+          <w:sz w:val="22"/>
+          <w:szCs w:val="22"/>
+        </w:rPr>
         <w:t>Project Management Method</w:t>
       </w:r>
     </w:p>
@@ -7980,12 +8002,306 @@
     </w:p>
     <w:p>
       <w:pPr>
-        <w:rPr>
-          <w:rFonts w:ascii="Arial" w:hAnsi="Arial" w:cs="Arial"/>
-          <w:sz w:val="22"/>
-          <w:szCs w:val="22"/>
-        </w:rPr>
-      </w:pPr>
+        <w:pStyle w:val="ListParagraph"/>
+        <w:numPr>
+          <w:ilvl w:val="0"/>
+          <w:numId w:val="23"/>
+        </w:numPr>
+        <w:rPr>
+          <w:rFonts w:ascii="Arial" w:hAnsi="Arial" w:cs="Arial"/>
+          <w:sz w:val="22"/>
+          <w:szCs w:val="22"/>
+        </w:rPr>
+      </w:pPr>
+      <w:r>
+        <w:rPr>
+          <w:rFonts w:ascii="Arial" w:hAnsi="Arial" w:cs="Arial"/>
+          <w:sz w:val="22"/>
+          <w:szCs w:val="22"/>
+        </w:rPr>
+        <w:t>Cloud-Centric SaaS and B2C Model: Agile (Scrum)</w:t>
+      </w:r>
+    </w:p>
+    <w:p>
+      <w:pPr>
+        <w:rPr>
+          <w:rFonts w:ascii="Arial" w:hAnsi="Arial" w:cs="Arial"/>
+          <w:sz w:val="22"/>
+          <w:szCs w:val="22"/>
+        </w:rPr>
+      </w:pPr>
+      <w:r>
+        <w:rPr>
+          <w:rFonts w:ascii="Arial" w:hAnsi="Arial" w:cs="Arial"/>
+          <w:sz w:val="22"/>
+          <w:szCs w:val="22"/>
+        </w:rPr>
+        <w:t xml:space="preserve">The Agile Scrum methodology is the most appropriate project management approach for Initiative 1. </w:t>
+      </w:r>
+    </w:p>
+    <w:p>
+      <w:pPr>
+        <w:rPr>
+          <w:rFonts w:ascii="Arial" w:hAnsi="Arial" w:cs="Arial"/>
+          <w:sz w:val="22"/>
+          <w:szCs w:val="22"/>
+        </w:rPr>
+      </w:pPr>
+    </w:p>
+    <w:p>
+      <w:pPr>
+        <w:rPr>
+          <w:rFonts w:ascii="Arial" w:hAnsi="Arial" w:cs="Arial"/>
+          <w:sz w:val="22"/>
+          <w:szCs w:val="22"/>
+        </w:rPr>
+      </w:pPr>
+      <w:r>
+        <w:rPr>
+          <w:rFonts w:ascii="Arial" w:hAnsi="Arial" w:cs="Arial"/>
+          <w:sz w:val="22"/>
+          <w:szCs w:val="22"/>
+        </w:rPr>
+        <w:t>This initiative involves developing software with evolving requirements, the need for continuous stakeholder feedback, and iterative delivery</w:t>
+      </w:r>
+      <w:r>
+        <w:rPr>
+          <w:rFonts w:ascii="Arial" w:hAnsi="Arial" w:cs="Arial"/>
+          <w:sz w:val="22"/>
+          <w:szCs w:val="22"/>
+        </w:rPr>
+        <w:t xml:space="preserve"> </w:t>
+      </w:r>
+      <w:r>
+        <w:rPr>
+          <w:rFonts w:ascii="Arial" w:hAnsi="Arial" w:cs="Arial"/>
+          <w:sz w:val="22"/>
+          <w:szCs w:val="22"/>
+        </w:rPr>
+        <w:t>all characteristics for which Agile is specifically designed.</w:t>
+      </w:r>
+    </w:p>
+    <w:p>
+      <w:pPr>
+        <w:rPr>
+          <w:rFonts w:ascii="Arial" w:hAnsi="Arial" w:cs="Arial"/>
+          <w:sz w:val="22"/>
+          <w:szCs w:val="22"/>
+        </w:rPr>
+      </w:pPr>
+    </w:p>
+    <w:p>
+      <w:pPr>
+        <w:rPr>
+          <w:rFonts w:ascii="Arial" w:hAnsi="Arial" w:cs="Arial"/>
+          <w:sz w:val="22"/>
+          <w:szCs w:val="22"/>
+        </w:rPr>
+      </w:pPr>
+      <w:r>
+        <w:rPr>
+          <w:rFonts w:ascii="Arial" w:hAnsi="Arial" w:cs="Arial"/>
+          <w:sz w:val="22"/>
+          <w:szCs w:val="22"/>
+        </w:rPr>
+        <w:t xml:space="preserve">Scrum organizes work into sprints with two- to four-week timeframes, and each sprint delivers a tested and potentially </w:t>
+      </w:r>
+      <w:proofErr w:type="spellStart"/>
+      <w:r>
+        <w:rPr>
+          <w:rFonts w:ascii="Arial" w:hAnsi="Arial" w:cs="Arial"/>
+          <w:sz w:val="22"/>
+          <w:szCs w:val="22"/>
+        </w:rPr>
+        <w:t>releaseable</w:t>
+      </w:r>
+      <w:proofErr w:type="spellEnd"/>
+      <w:r>
+        <w:rPr>
+          <w:rFonts w:ascii="Arial" w:hAnsi="Arial" w:cs="Arial"/>
+          <w:sz w:val="22"/>
+          <w:szCs w:val="22"/>
+        </w:rPr>
+        <w:t xml:space="preserve"> increment of the SaaS platform. Scrum ceremonies (sprint planning, daily stand-ups, sprint reviews, and retrospectives) ensure continuous progress tracking, rapid problem identification, and ongoing adaptation to changing requirements.</w:t>
+      </w:r>
+    </w:p>
+    <w:p>
+      <w:pPr>
+        <w:rPr>
+          <w:rFonts w:ascii="Arial" w:hAnsi="Arial" w:cs="Arial"/>
+          <w:sz w:val="22"/>
+          <w:szCs w:val="22"/>
+        </w:rPr>
+      </w:pPr>
+    </w:p>
+    <w:p>
+      <w:pPr>
+        <w:rPr>
+          <w:rFonts w:ascii="Arial" w:hAnsi="Arial" w:cs="Arial"/>
+          <w:sz w:val="22"/>
+          <w:szCs w:val="22"/>
+        </w:rPr>
+      </w:pPr>
+      <w:r>
+        <w:rPr>
+          <w:rFonts w:ascii="Arial" w:hAnsi="Arial" w:cs="Arial"/>
+          <w:sz w:val="22"/>
+          <w:szCs w:val="22"/>
+        </w:rPr>
+        <w:t xml:space="preserve">This approach is well-aligned with </w:t>
+      </w:r>
+      <w:proofErr w:type="spellStart"/>
+      <w:r>
+        <w:rPr>
+          <w:rFonts w:ascii="Arial" w:hAnsi="Arial" w:cs="Arial"/>
+          <w:sz w:val="22"/>
+          <w:szCs w:val="22"/>
+        </w:rPr>
+        <w:t>Worlducation's</w:t>
+      </w:r>
+      <w:proofErr w:type="spellEnd"/>
+      <w:r>
+        <w:rPr>
+          <w:rFonts w:ascii="Arial" w:hAnsi="Arial" w:cs="Arial"/>
+          <w:sz w:val="22"/>
+          <w:szCs w:val="22"/>
+        </w:rPr>
+        <w:t xml:space="preserve"> core values ​​of innovation and collaboration and supports the strategic priority of enhancing responsiveness to change. The Scrum framework also allows the Development Team in Bulgaria to work in parallel with the Business Analysis activities in Sydney, maintaining alignment through sprint reviews and work refinement sessions.</w:t>
+      </w:r>
+    </w:p>
+    <w:p>
+      <w:pPr>
+        <w:rPr>
+          <w:rFonts w:ascii="Arial" w:hAnsi="Arial" w:cs="Arial"/>
+          <w:sz w:val="22"/>
+          <w:szCs w:val="22"/>
+        </w:rPr>
+      </w:pPr>
+    </w:p>
+    <w:p>
+      <w:pPr>
+        <w:pStyle w:val="ListParagraph"/>
+        <w:numPr>
+          <w:ilvl w:val="0"/>
+          <w:numId w:val="23"/>
+        </w:numPr>
+        <w:rPr>
+          <w:rFonts w:ascii="Arial" w:hAnsi="Arial" w:cs="Arial"/>
+          <w:sz w:val="22"/>
+          <w:szCs w:val="22"/>
+        </w:rPr>
+      </w:pPr>
+      <w:r>
+        <w:rPr>
+          <w:rFonts w:ascii="Arial" w:hAnsi="Arial" w:cs="Arial"/>
+          <w:sz w:val="22"/>
+          <w:szCs w:val="22"/>
+        </w:rPr>
+        <w:t>Strategic Hardware Partnerships and Outsourced Distribution: Structured Stage (Influenced by PRINCE2)</w:t>
+      </w:r>
+    </w:p>
+    <w:p>
+      <w:pPr>
+        <w:rPr>
+          <w:rFonts w:ascii="Arial" w:hAnsi="Arial" w:cs="Arial"/>
+          <w:sz w:val="22"/>
+          <w:szCs w:val="22"/>
+        </w:rPr>
+      </w:pPr>
+      <w:r>
+        <w:rPr>
+          <w:rFonts w:ascii="Arial" w:hAnsi="Arial" w:cs="Arial"/>
+          <w:sz w:val="22"/>
+          <w:szCs w:val="22"/>
+        </w:rPr>
+        <w:t>The Structured Stage-Gate methodology, based on PRINCE2 principles, is the most appropriate project management approach for Initiative 2.</w:t>
+      </w:r>
+    </w:p>
+    <w:p>
+      <w:pPr>
+        <w:rPr>
+          <w:rFonts w:ascii="Arial" w:hAnsi="Arial" w:cs="Arial"/>
+          <w:sz w:val="22"/>
+          <w:szCs w:val="22"/>
+        </w:rPr>
+      </w:pPr>
+    </w:p>
+    <w:p>
+      <w:pPr>
+        <w:rPr>
+          <w:rFonts w:ascii="Arial" w:hAnsi="Arial" w:cs="Arial"/>
+          <w:sz w:val="22"/>
+          <w:szCs w:val="22"/>
+        </w:rPr>
+      </w:pPr>
+      <w:r>
+        <w:rPr>
+          <w:rFonts w:ascii="Arial" w:hAnsi="Arial" w:cs="Arial"/>
+          <w:sz w:val="22"/>
+          <w:szCs w:val="22"/>
+        </w:rPr>
+        <w:t>This initiative involves well-defined stages (market research, partner evaluation, contract negotiation, ERP integration and implementation), clear decision points requiring formal governance approval, and defined deliverables at each stage</w:t>
+      </w:r>
+      <w:r>
+        <w:rPr>
+          <w:rFonts w:ascii="Arial" w:hAnsi="Arial" w:cs="Arial"/>
+          <w:sz w:val="22"/>
+          <w:szCs w:val="22"/>
+        </w:rPr>
+        <w:t xml:space="preserve"> </w:t>
+      </w:r>
+      <w:r>
+        <w:rPr>
+          <w:rFonts w:ascii="Arial" w:hAnsi="Arial" w:cs="Arial"/>
+          <w:sz w:val="22"/>
+          <w:szCs w:val="22"/>
+        </w:rPr>
+        <w:t>all characteristics well-suited to a structured and sequential approach.</w:t>
+      </w:r>
+    </w:p>
+    <w:p>
+      <w:pPr>
+        <w:rPr>
+          <w:rFonts w:ascii="Arial" w:hAnsi="Arial" w:cs="Arial"/>
+          <w:sz w:val="22"/>
+          <w:szCs w:val="22"/>
+        </w:rPr>
+      </w:pPr>
+    </w:p>
+    <w:p>
+      <w:pPr>
+        <w:rPr>
+          <w:rFonts w:ascii="Arial" w:hAnsi="Arial" w:cs="Arial"/>
+          <w:sz w:val="22"/>
+          <w:szCs w:val="22"/>
+        </w:rPr>
+      </w:pPr>
+      <w:r>
+        <w:rPr>
+          <w:rFonts w:ascii="Arial" w:hAnsi="Arial" w:cs="Arial"/>
+          <w:sz w:val="22"/>
+          <w:szCs w:val="22"/>
+        </w:rPr>
+        <w:t xml:space="preserve">Unlike Agile, which is designed for software development with evolving requirements, Initiative 2 requires formal documentation, compliance with </w:t>
+      </w:r>
+      <w:proofErr w:type="spellStart"/>
+      <w:r>
+        <w:rPr>
+          <w:rFonts w:ascii="Arial" w:hAnsi="Arial" w:cs="Arial"/>
+          <w:sz w:val="22"/>
+          <w:szCs w:val="22"/>
+        </w:rPr>
+        <w:t>Worlducation's</w:t>
+      </w:r>
+      <w:proofErr w:type="spellEnd"/>
+      <w:r>
+        <w:rPr>
+          <w:rFonts w:ascii="Arial" w:hAnsi="Arial" w:cs="Arial"/>
+          <w:sz w:val="22"/>
+          <w:szCs w:val="22"/>
+        </w:rPr>
+        <w:t xml:space="preserve"> new Supplier Policy (supplier selection background information, supplier review checklist, appointment of a business manager, and bank verification), and prior authorization of all financial commitments by Anna Armstrong before proceeding to each subsequent stage. The stage-gate model ensures a formal go-ahead/no-go review at each phase transition, reducing the risk of committing to a partner without completing due diligence. The quarterly supplier payment review cycle required by the new Supplier Policy is also consistent with this structured governance approach.</w:t>
+      </w:r>
     </w:p>
     <w:sectPr>
       <w:pgSz w:w="11906" w:h="16838"/>
@@ -8238,6 +8554,95 @@
     </w:lvl>
   </w:abstractNum>
   <w:abstractNum w:abstractNumId="2" w15:restartNumberingAfterBreak="0">
+    <w:nsid w:val="0D9B187D"/>
+    <w:multiLevelType w:val="hybridMultilevel"/>
+    <w:tmpl w:val="F4864A54"/>
+    <w:lvl w:ilvl="0" w:tplc="0809000F">
+      <w:start w:val="1"/>
+      <w:numFmt w:val="decimal"/>
+      <w:lvlText w:val="%1."/>
+      <w:lvlJc w:val="left"/>
+      <w:pPr>
+        <w:ind w:left="720" w:hanging="360"/>
+      </w:pPr>
+      <w:rPr>
+        <w:rFonts w:hint="default"/>
+      </w:rPr>
+    </w:lvl>
+    <w:lvl w:ilvl="1" w:tplc="08090019" w:tentative="1">
+      <w:start w:val="1"/>
+      <w:numFmt w:val="lowerLetter"/>
+      <w:lvlText w:val="%2."/>
+      <w:lvlJc w:val="left"/>
+      <w:pPr>
+        <w:ind w:left="1440" w:hanging="360"/>
+      </w:pPr>
+    </w:lvl>
+    <w:lvl w:ilvl="2" w:tplc="0809001B" w:tentative="1">
+      <w:start w:val="1"/>
+      <w:numFmt w:val="lowerRoman"/>
+      <w:lvlText w:val="%3."/>
+      <w:lvlJc w:val="right"/>
+      <w:pPr>
+        <w:ind w:left="2160" w:hanging="180"/>
+      </w:pPr>
+    </w:lvl>
+    <w:lvl w:ilvl="3" w:tplc="0809000F" w:tentative="1">
+      <w:start w:val="1"/>
+      <w:numFmt w:val="decimal"/>
+      <w:lvlText w:val="%4."/>
+      <w:lvlJc w:val="left"/>
+      <w:pPr>
+        <w:ind w:left="2880" w:hanging="360"/>
+      </w:pPr>
+    </w:lvl>
+    <w:lvl w:ilvl="4" w:tplc="08090019" w:tentative="1">
+      <w:start w:val="1"/>
+      <w:numFmt w:val="lowerLetter"/>
+      <w:lvlText w:val="%5."/>
+      <w:lvlJc w:val="left"/>
+      <w:pPr>
+        <w:ind w:left="3600" w:hanging="360"/>
+      </w:pPr>
+    </w:lvl>
+    <w:lvl w:ilvl="5" w:tplc="0809001B" w:tentative="1">
+      <w:start w:val="1"/>
+      <w:numFmt w:val="lowerRoman"/>
+      <w:lvlText w:val="%6."/>
+      <w:lvlJc w:val="right"/>
+      <w:pPr>
+        <w:ind w:left="4320" w:hanging="180"/>
+      </w:pPr>
+    </w:lvl>
+    <w:lvl w:ilvl="6" w:tplc="0809000F" w:tentative="1">
+      <w:start w:val="1"/>
+      <w:numFmt w:val="decimal"/>
+      <w:lvlText w:val="%7."/>
+      <w:lvlJc w:val="left"/>
+      <w:pPr>
+        <w:ind w:left="5040" w:hanging="360"/>
+      </w:pPr>
+    </w:lvl>
+    <w:lvl w:ilvl="7" w:tplc="08090019" w:tentative="1">
+      <w:start w:val="1"/>
+      <w:numFmt w:val="lowerLetter"/>
+      <w:lvlText w:val="%8."/>
+      <w:lvlJc w:val="left"/>
+      <w:pPr>
+        <w:ind w:left="5760" w:hanging="360"/>
+      </w:pPr>
+    </w:lvl>
+    <w:lvl w:ilvl="8" w:tplc="0809001B" w:tentative="1">
+      <w:start w:val="1"/>
+      <w:numFmt w:val="lowerRoman"/>
+      <w:lvlText w:val="%9."/>
+      <w:lvlJc w:val="right"/>
+      <w:pPr>
+        <w:ind w:left="6480" w:hanging="180"/>
+      </w:pPr>
+    </w:lvl>
+  </w:abstractNum>
+  <w:abstractNum w:abstractNumId="3" w15:restartNumberingAfterBreak="0">
     <w:nsid w:val="113C59F1"/>
     <w:multiLevelType w:val="multilevel"/>
     <w:tmpl w:val="66D8D3C4"/>
@@ -8386,7 +8791,7 @@
       </w:rPr>
     </w:lvl>
   </w:abstractNum>
-  <w:abstractNum w:abstractNumId="3" w15:restartNumberingAfterBreak="0">
+  <w:abstractNum w:abstractNumId="4" w15:restartNumberingAfterBreak="0">
     <w:nsid w:val="1B890B33"/>
     <w:multiLevelType w:val="multilevel"/>
     <w:tmpl w:val="9A761358"/>
@@ -8535,7 +8940,7 @@
       </w:rPr>
     </w:lvl>
   </w:abstractNum>
-  <w:abstractNum w:abstractNumId="4" w15:restartNumberingAfterBreak="0">
+  <w:abstractNum w:abstractNumId="5" w15:restartNumberingAfterBreak="0">
     <w:nsid w:val="1E526D28"/>
     <w:multiLevelType w:val="multilevel"/>
     <w:tmpl w:val="E61E96DA"/>
@@ -8684,7 +9089,7 @@
       </w:rPr>
     </w:lvl>
   </w:abstractNum>
-  <w:abstractNum w:abstractNumId="5" w15:restartNumberingAfterBreak="0">
+  <w:abstractNum w:abstractNumId="6" w15:restartNumberingAfterBreak="0">
     <w:nsid w:val="291B1D4C"/>
     <w:multiLevelType w:val="multilevel"/>
     <w:tmpl w:val="25A8E8A2"/>
@@ -8833,7 +9238,7 @@
       </w:rPr>
     </w:lvl>
   </w:abstractNum>
-  <w:abstractNum w:abstractNumId="6" w15:restartNumberingAfterBreak="0">
+  <w:abstractNum w:abstractNumId="7" w15:restartNumberingAfterBreak="0">
     <w:nsid w:val="2B2026EC"/>
     <w:multiLevelType w:val="multilevel"/>
     <w:tmpl w:val="A98CDBF2"/>
@@ -8982,7 +9387,7 @@
       </w:rPr>
     </w:lvl>
   </w:abstractNum>
-  <w:abstractNum w:abstractNumId="7" w15:restartNumberingAfterBreak="0">
+  <w:abstractNum w:abstractNumId="8" w15:restartNumberingAfterBreak="0">
     <w:nsid w:val="2C200EEE"/>
     <w:multiLevelType w:val="multilevel"/>
     <w:tmpl w:val="E2E06D82"/>
@@ -9131,7 +9536,7 @@
       </w:rPr>
     </w:lvl>
   </w:abstractNum>
-  <w:abstractNum w:abstractNumId="8" w15:restartNumberingAfterBreak="0">
+  <w:abstractNum w:abstractNumId="9" w15:restartNumberingAfterBreak="0">
     <w:nsid w:val="45D42475"/>
     <w:multiLevelType w:val="multilevel"/>
     <w:tmpl w:val="94867490"/>
@@ -9280,7 +9685,7 @@
       </w:rPr>
     </w:lvl>
   </w:abstractNum>
-  <w:abstractNum w:abstractNumId="9" w15:restartNumberingAfterBreak="0">
+  <w:abstractNum w:abstractNumId="10" w15:restartNumberingAfterBreak="0">
     <w:nsid w:val="4B8F7330"/>
     <w:multiLevelType w:val="multilevel"/>
     <w:tmpl w:val="86B07C14"/>
@@ -9429,7 +9834,7 @@
       </w:rPr>
     </w:lvl>
   </w:abstractNum>
-  <w:abstractNum w:abstractNumId="10" w15:restartNumberingAfterBreak="0">
+  <w:abstractNum w:abstractNumId="11" w15:restartNumberingAfterBreak="0">
     <w:nsid w:val="4E8E5320"/>
     <w:multiLevelType w:val="multilevel"/>
     <w:tmpl w:val="8C40FDA4"/>
@@ -9578,7 +9983,7 @@
       </w:rPr>
     </w:lvl>
   </w:abstractNum>
-  <w:abstractNum w:abstractNumId="11" w15:restartNumberingAfterBreak="0">
+  <w:abstractNum w:abstractNumId="12" w15:restartNumberingAfterBreak="0">
     <w:nsid w:val="4ED3475E"/>
     <w:multiLevelType w:val="multilevel"/>
     <w:tmpl w:val="457CF4BA"/>
@@ -9727,7 +10132,7 @@
       </w:rPr>
     </w:lvl>
   </w:abstractNum>
-  <w:abstractNum w:abstractNumId="12" w15:restartNumberingAfterBreak="0">
+  <w:abstractNum w:abstractNumId="13" w15:restartNumberingAfterBreak="0">
     <w:nsid w:val="5CFB5BD0"/>
     <w:multiLevelType w:val="hybridMultilevel"/>
     <w:tmpl w:val="3DD6BFE4"/>
@@ -9840,7 +10245,7 @@
       </w:rPr>
     </w:lvl>
   </w:abstractNum>
-  <w:abstractNum w:abstractNumId="13" w15:restartNumberingAfterBreak="0">
+  <w:abstractNum w:abstractNumId="14" w15:restartNumberingAfterBreak="0">
     <w:nsid w:val="664C4BE2"/>
     <w:multiLevelType w:val="hybridMultilevel"/>
     <w:tmpl w:val="26CA9C52"/>
@@ -9929,7 +10334,96 @@
       </w:pPr>
     </w:lvl>
   </w:abstractNum>
-  <w:abstractNum w:abstractNumId="14" w15:restartNumberingAfterBreak="0">
+  <w:abstractNum w:abstractNumId="15" w15:restartNumberingAfterBreak="0">
+    <w:nsid w:val="66726260"/>
+    <w:multiLevelType w:val="hybridMultilevel"/>
+    <w:tmpl w:val="FFA28A4C"/>
+    <w:lvl w:ilvl="0" w:tplc="0809000F">
+      <w:start w:val="1"/>
+      <w:numFmt w:val="decimal"/>
+      <w:lvlText w:val="%1."/>
+      <w:lvlJc w:val="left"/>
+      <w:pPr>
+        <w:ind w:left="720" w:hanging="360"/>
+      </w:pPr>
+      <w:rPr>
+        <w:rFonts w:hint="default"/>
+      </w:rPr>
+    </w:lvl>
+    <w:lvl w:ilvl="1" w:tplc="08090019" w:tentative="1">
+      <w:start w:val="1"/>
+      <w:numFmt w:val="lowerLetter"/>
+      <w:lvlText w:val="%2."/>
+      <w:lvlJc w:val="left"/>
+      <w:pPr>
+        <w:ind w:left="1440" w:hanging="360"/>
+      </w:pPr>
+    </w:lvl>
+    <w:lvl w:ilvl="2" w:tplc="0809001B" w:tentative="1">
+      <w:start w:val="1"/>
+      <w:numFmt w:val="lowerRoman"/>
+      <w:lvlText w:val="%3."/>
+      <w:lvlJc w:val="right"/>
+      <w:pPr>
+        <w:ind w:left="2160" w:hanging="180"/>
+      </w:pPr>
+    </w:lvl>
+    <w:lvl w:ilvl="3" w:tplc="0809000F" w:tentative="1">
+      <w:start w:val="1"/>
+      <w:numFmt w:val="decimal"/>
+      <w:lvlText w:val="%4."/>
+      <w:lvlJc w:val="left"/>
+      <w:pPr>
+        <w:ind w:left="2880" w:hanging="360"/>
+      </w:pPr>
+    </w:lvl>
+    <w:lvl w:ilvl="4" w:tplc="08090019" w:tentative="1">
+      <w:start w:val="1"/>
+      <w:numFmt w:val="lowerLetter"/>
+      <w:lvlText w:val="%5."/>
+      <w:lvlJc w:val="left"/>
+      <w:pPr>
+        <w:ind w:left="3600" w:hanging="360"/>
+      </w:pPr>
+    </w:lvl>
+    <w:lvl w:ilvl="5" w:tplc="0809001B" w:tentative="1">
+      <w:start w:val="1"/>
+      <w:numFmt w:val="lowerRoman"/>
+      <w:lvlText w:val="%6."/>
+      <w:lvlJc w:val="right"/>
+      <w:pPr>
+        <w:ind w:left="4320" w:hanging="180"/>
+      </w:pPr>
+    </w:lvl>
+    <w:lvl w:ilvl="6" w:tplc="0809000F" w:tentative="1">
+      <w:start w:val="1"/>
+      <w:numFmt w:val="decimal"/>
+      <w:lvlText w:val="%7."/>
+      <w:lvlJc w:val="left"/>
+      <w:pPr>
+        <w:ind w:left="5040" w:hanging="360"/>
+      </w:pPr>
+    </w:lvl>
+    <w:lvl w:ilvl="7" w:tplc="08090019" w:tentative="1">
+      <w:start w:val="1"/>
+      <w:numFmt w:val="lowerLetter"/>
+      <w:lvlText w:val="%8."/>
+      <w:lvlJc w:val="left"/>
+      <w:pPr>
+        <w:ind w:left="5760" w:hanging="360"/>
+      </w:pPr>
+    </w:lvl>
+    <w:lvl w:ilvl="8" w:tplc="0809001B" w:tentative="1">
+      <w:start w:val="1"/>
+      <w:numFmt w:val="lowerRoman"/>
+      <w:lvlText w:val="%9."/>
+      <w:lvlJc w:val="right"/>
+      <w:pPr>
+        <w:ind w:left="6480" w:hanging="180"/>
+      </w:pPr>
+    </w:lvl>
+  </w:abstractNum>
+  <w:abstractNum w:abstractNumId="16" w15:restartNumberingAfterBreak="0">
     <w:nsid w:val="68427343"/>
     <w:multiLevelType w:val="multilevel"/>
     <w:tmpl w:val="61965642"/>
@@ -10078,7 +10572,7 @@
       </w:rPr>
     </w:lvl>
   </w:abstractNum>
-  <w:abstractNum w:abstractNumId="15" w15:restartNumberingAfterBreak="0">
+  <w:abstractNum w:abstractNumId="17" w15:restartNumberingAfterBreak="0">
     <w:nsid w:val="69B45CEF"/>
     <w:multiLevelType w:val="multilevel"/>
     <w:tmpl w:val="2FD69B20"/>
@@ -10227,7 +10721,7 @@
       </w:rPr>
     </w:lvl>
   </w:abstractNum>
-  <w:abstractNum w:abstractNumId="16" w15:restartNumberingAfterBreak="0">
+  <w:abstractNum w:abstractNumId="18" w15:restartNumberingAfterBreak="0">
     <w:nsid w:val="6B7832EC"/>
     <w:multiLevelType w:val="multilevel"/>
     <w:tmpl w:val="A81A89CA"/>
@@ -10376,7 +10870,7 @@
       </w:rPr>
     </w:lvl>
   </w:abstractNum>
-  <w:abstractNum w:abstractNumId="17" w15:restartNumberingAfterBreak="0">
+  <w:abstractNum w:abstractNumId="19" w15:restartNumberingAfterBreak="0">
     <w:nsid w:val="73072708"/>
     <w:multiLevelType w:val="hybridMultilevel"/>
     <w:tmpl w:val="632CFC68"/>
@@ -10465,7 +10959,7 @@
       </w:pPr>
     </w:lvl>
   </w:abstractNum>
-  <w:abstractNum w:abstractNumId="18" w15:restartNumberingAfterBreak="0">
+  <w:abstractNum w:abstractNumId="20" w15:restartNumberingAfterBreak="0">
     <w:nsid w:val="73321BBA"/>
     <w:multiLevelType w:val="multilevel"/>
     <w:tmpl w:val="EFE6DFCA"/>
@@ -10614,7 +11108,7 @@
       </w:rPr>
     </w:lvl>
   </w:abstractNum>
-  <w:abstractNum w:abstractNumId="19" w15:restartNumberingAfterBreak="0">
+  <w:abstractNum w:abstractNumId="21" w15:restartNumberingAfterBreak="0">
     <w:nsid w:val="78BD4B0A"/>
     <w:multiLevelType w:val="multilevel"/>
     <w:tmpl w:val="0E5AF6F0"/>
@@ -10763,7 +11257,7 @@
       </w:rPr>
     </w:lvl>
   </w:abstractNum>
-  <w:abstractNum w:abstractNumId="20" w15:restartNumberingAfterBreak="0">
+  <w:abstractNum w:abstractNumId="22" w15:restartNumberingAfterBreak="0">
     <w:nsid w:val="79FD2B7C"/>
     <w:multiLevelType w:val="multilevel"/>
     <w:tmpl w:val="FEC8E97E"/>
@@ -10913,67 +11407,73 @@
     </w:lvl>
   </w:abstractNum>
   <w:num w:numId="1" w16cid:durableId="1651977992">
-    <w:abstractNumId w:val="18"/>
+    <w:abstractNumId w:val="20"/>
   </w:num>
   <w:num w:numId="2" w16cid:durableId="222713874">
     <w:abstractNumId w:val="1"/>
   </w:num>
   <w:num w:numId="3" w16cid:durableId="1897811804">
+    <w:abstractNumId w:val="21"/>
+  </w:num>
+  <w:num w:numId="4" w16cid:durableId="480998893">
+    <w:abstractNumId w:val="12"/>
+  </w:num>
+  <w:num w:numId="5" w16cid:durableId="627710897">
+    <w:abstractNumId w:val="11"/>
+  </w:num>
+  <w:num w:numId="6" w16cid:durableId="1650670057">
+    <w:abstractNumId w:val="5"/>
+  </w:num>
+  <w:num w:numId="7" w16cid:durableId="1062102917">
+    <w:abstractNumId w:val="18"/>
+  </w:num>
+  <w:num w:numId="8" w16cid:durableId="879586373">
+    <w:abstractNumId w:val="7"/>
+  </w:num>
+  <w:num w:numId="9" w16cid:durableId="1369069069">
+    <w:abstractNumId w:val="16"/>
+  </w:num>
+  <w:num w:numId="10" w16cid:durableId="245656287">
+    <w:abstractNumId w:val="22"/>
+  </w:num>
+  <w:num w:numId="11" w16cid:durableId="435977825">
+    <w:abstractNumId w:val="9"/>
+  </w:num>
+  <w:num w:numId="12" w16cid:durableId="1315985183">
+    <w:abstractNumId w:val="8"/>
+  </w:num>
+  <w:num w:numId="13" w16cid:durableId="1158885373">
+    <w:abstractNumId w:val="4"/>
+  </w:num>
+  <w:num w:numId="14" w16cid:durableId="1310137639">
+    <w:abstractNumId w:val="10"/>
+  </w:num>
+  <w:num w:numId="15" w16cid:durableId="248657663">
+    <w:abstractNumId w:val="6"/>
+  </w:num>
+  <w:num w:numId="16" w16cid:durableId="1338919693">
+    <w:abstractNumId w:val="3"/>
+  </w:num>
+  <w:num w:numId="17" w16cid:durableId="1705866966">
+    <w:abstractNumId w:val="17"/>
+  </w:num>
+  <w:num w:numId="18" w16cid:durableId="1640526705">
+    <w:abstractNumId w:val="14"/>
+  </w:num>
+  <w:num w:numId="19" w16cid:durableId="1013218433">
     <w:abstractNumId w:val="19"/>
   </w:num>
-  <w:num w:numId="4" w16cid:durableId="480998893">
-    <w:abstractNumId w:val="11"/>
-  </w:num>
-  <w:num w:numId="5" w16cid:durableId="627710897">
-    <w:abstractNumId w:val="10"/>
-  </w:num>
-  <w:num w:numId="6" w16cid:durableId="1650670057">
-    <w:abstractNumId w:val="4"/>
-  </w:num>
-  <w:num w:numId="7" w16cid:durableId="1062102917">
-    <w:abstractNumId w:val="16"/>
-  </w:num>
-  <w:num w:numId="8" w16cid:durableId="879586373">
-    <w:abstractNumId w:val="6"/>
-  </w:num>
-  <w:num w:numId="9" w16cid:durableId="1369069069">
-    <w:abstractNumId w:val="14"/>
-  </w:num>
-  <w:num w:numId="10" w16cid:durableId="245656287">
-    <w:abstractNumId w:val="20"/>
-  </w:num>
-  <w:num w:numId="11" w16cid:durableId="435977825">
-    <w:abstractNumId w:val="8"/>
-  </w:num>
-  <w:num w:numId="12" w16cid:durableId="1315985183">
-    <w:abstractNumId w:val="7"/>
-  </w:num>
-  <w:num w:numId="13" w16cid:durableId="1158885373">
-    <w:abstractNumId w:val="3"/>
-  </w:num>
-  <w:num w:numId="14" w16cid:durableId="1310137639">
-    <w:abstractNumId w:val="9"/>
-  </w:num>
-  <w:num w:numId="15" w16cid:durableId="248657663">
-    <w:abstractNumId w:val="5"/>
-  </w:num>
-  <w:num w:numId="16" w16cid:durableId="1338919693">
-    <w:abstractNumId w:val="2"/>
-  </w:num>
-  <w:num w:numId="17" w16cid:durableId="1705866966">
-    <w:abstractNumId w:val="15"/>
-  </w:num>
-  <w:num w:numId="18" w16cid:durableId="1640526705">
+  <w:num w:numId="20" w16cid:durableId="1723140307">
     <w:abstractNumId w:val="13"/>
-  </w:num>
-  <w:num w:numId="19" w16cid:durableId="1013218433">
-    <w:abstractNumId w:val="17"/>
-  </w:num>
-  <w:num w:numId="20" w16cid:durableId="1723140307">
-    <w:abstractNumId w:val="12"/>
   </w:num>
   <w:num w:numId="21" w16cid:durableId="474951159">
     <w:abstractNumId w:val="0"/>
+  </w:num>
+  <w:num w:numId="22" w16cid:durableId="1077551572">
+    <w:abstractNumId w:val="2"/>
+  </w:num>
+  <w:num w:numId="23" w16cid:durableId="133723997">
+    <w:abstractNumId w:val="15"/>
   </w:num>
 </w:numbering>
 </file>

</xml_diff>